<commit_message>
actualizacion de informacion y se agrego la tabla de versionamientos y completar la tabla de contenido
</commit_message>
<xml_diff>
--- a/Manuales_JAME/Manual de instalacion jame web1Act.docx
+++ b/Manuales_JAME/Manual de instalacion jame web1Act.docx
@@ -1,6 +1,6 @@
 
 <file path=word/document.xml><?xml version="1.0" encoding="utf-8"?>
-<w:document xmlns:wpc="http://schemas.microsoft.com/office/word/2010/wordprocessingCanvas" xmlns:cx="http://schemas.microsoft.com/office/drawing/2014/chartex" xmlns:cx1="http://schemas.microsoft.com/office/drawing/2015/9/8/chartex" xmlns:cx2="http://schemas.microsoft.com/office/drawing/2015/10/21/chartex" xmlns:cx3="http://schemas.microsoft.com/office/drawing/2016/5/9/chartex" xmlns:cx4="http://schemas.microsoft.com/office/drawing/2016/5/10/chartex" xmlns:cx5="http://schemas.microsoft.com/office/drawing/2016/5/11/chartex" xmlns:cx6="http://schemas.microsoft.com/office/drawing/2016/5/12/chartex" xmlns:cx7="http://schemas.microsoft.com/office/drawing/2016/5/13/chartex" xmlns:cx8="http://schemas.microsoft.com/office/drawing/2016/5/14/chartex" xmlns:mc="http://schemas.openxmlformats.org/markup-compatibility/2006" xmlns:aink="http://schemas.microsoft.com/office/drawing/2016/ink" xmlns:am3d="http://schemas.microsoft.com/office/drawing/2017/model3d" xmlns:o="urn:schemas-microsoft-com:office:office" xmlns:oel="http://schemas.microsoft.com/office/2019/extlst" xmlns:r="http://schemas.openxmlformats.org/officeDocument/2006/relationships" xmlns:m="http://schemas.openxmlformats.org/officeDocument/2006/math" xmlns:v="urn:schemas-microsoft-com:vml" xmlns:wp14="http://schemas.microsoft.com/office/word/2010/wordprocessingDrawing" xmlns:wp="http://schemas.openxmlformats.org/drawingml/2006/wordprocessingDrawing" xmlns:w10="urn:schemas-microsoft-com:office:word" xmlns:w="http://schemas.openxmlformats.org/wordprocessingml/2006/main" xmlns:w14="http://schemas.microsoft.com/office/word/2010/wordml" xmlns:w15="http://schemas.microsoft.com/office/word/2012/wordml" xmlns:w16cex="http://schemas.microsoft.com/office/word/2018/wordml/cex" xmlns:w16cid="http://schemas.microsoft.com/office/word/2016/wordml/cid" xmlns:w16="http://schemas.microsoft.com/office/word/2018/wordml" xmlns:w16du="http://schemas.microsoft.com/office/word/2023/wordml/word16du" xmlns:w16sdtdh="http://schemas.microsoft.com/office/word/2020/wordml/sdtdatahash" xmlns:w16sdtfl="http://schemas.microsoft.com/office/word/2024/wordml/sdtformatlock" xmlns:w16se="http://schemas.microsoft.com/office/word/2015/wordml/symex" xmlns:wpg="http://schemas.microsoft.com/office/word/2010/wordprocessingGroup" xmlns:wpi="http://schemas.microsoft.com/office/word/2010/wordprocessingInk" xmlns:wne="http://schemas.microsoft.com/office/word/2006/wordml" xmlns:wps="http://schemas.microsoft.com/office/word/2010/wordprocessingShape" mc:Ignorable="w14 w15 w16se w16cid w16 w16cex w16sdtdh w16sdtfl w16du wp14">
+<w:document xmlns:wpc="http://schemas.microsoft.com/office/word/2010/wordprocessingCanvas" xmlns:cx="http://schemas.microsoft.com/office/drawing/2014/chartex" xmlns:cx1="http://schemas.microsoft.com/office/drawing/2015/9/8/chartex" xmlns:cx2="http://schemas.microsoft.com/office/drawing/2015/10/21/chartex" xmlns:cx3="http://schemas.microsoft.com/office/drawing/2016/5/9/chartex" xmlns:cx4="http://schemas.microsoft.com/office/drawing/2016/5/10/chartex" xmlns:cx5="http://schemas.microsoft.com/office/drawing/2016/5/11/chartex" xmlns:cx6="http://schemas.microsoft.com/office/drawing/2016/5/12/chartex" xmlns:cx7="http://schemas.microsoft.com/office/drawing/2016/5/13/chartex" xmlns:cx8="http://schemas.microsoft.com/office/drawing/2016/5/14/chartex" xmlns:mc="http://schemas.openxmlformats.org/markup-compatibility/2006" xmlns:aink="http://schemas.microsoft.com/office/drawing/2016/ink" xmlns:am3d="http://schemas.microsoft.com/office/drawing/2017/model3d" xmlns:o="urn:schemas-microsoft-com:office:office" xmlns:r="http://schemas.openxmlformats.org/officeDocument/2006/relationships" xmlns:m="http://schemas.openxmlformats.org/officeDocument/2006/math" xmlns:v="urn:schemas-microsoft-com:vml" xmlns:wp14="http://schemas.microsoft.com/office/word/2010/wordprocessingDrawing" xmlns:wp="http://schemas.openxmlformats.org/drawingml/2006/wordprocessingDrawing" xmlns:w10="urn:schemas-microsoft-com:office:word" xmlns:w="http://schemas.openxmlformats.org/wordprocessingml/2006/main" xmlns:w14="http://schemas.microsoft.com/office/word/2010/wordml" xmlns:w15="http://schemas.microsoft.com/office/word/2012/wordml" xmlns:w16cid="http://schemas.microsoft.com/office/word/2016/wordml/cid" xmlns:w16se="http://schemas.microsoft.com/office/word/2015/wordml/symex" xmlns:wpg="http://schemas.microsoft.com/office/word/2010/wordprocessingGroup" xmlns:wpi="http://schemas.microsoft.com/office/word/2010/wordprocessingInk" xmlns:wne="http://schemas.microsoft.com/office/word/2006/wordml" xmlns:wps="http://schemas.microsoft.com/office/word/2010/wordprocessingShape" mc:Ignorable="w14 w15 w16se w16cid wp14">
   <w:body>
     <w:tbl>
       <w:tblPr>
@@ -967,7 +967,11 @@
     <w:sdt>
       <w:sdtPr>
         <w:rPr>
-          <w:lang w:val="es-ES"/>
+          <w:rFonts w:asciiTheme="minorHAnsi" w:eastAsiaTheme="minorEastAsia" w:hAnsiTheme="minorHAnsi" w:cstheme="minorBidi"/>
+          <w:color w:val="auto"/>
+          <w:sz w:val="22"/>
+          <w:szCs w:val="22"/>
+          <w:lang w:val="es-ES" w:eastAsia="en-US"/>
         </w:rPr>
         <w:id w:val="1530833058"/>
         <w:docPartObj>
@@ -977,13 +981,8 @@
       </w:sdtPr>
       <w:sdtEndPr>
         <w:rPr>
-          <w:rFonts w:asciiTheme="minorHAnsi" w:eastAsiaTheme="minorEastAsia" w:hAnsiTheme="minorHAnsi" w:cstheme="minorBidi"/>
           <w:b/>
           <w:bCs/>
-          <w:color w:val="auto"/>
-          <w:sz w:val="22"/>
-          <w:szCs w:val="22"/>
-          <w:lang w:eastAsia="en-US"/>
         </w:rPr>
       </w:sdtEndPr>
       <w:sdtContent>
@@ -2403,19 +2402,16 @@
           </w:pPr>
         </w:p>
         <w:p/>
+        <w:p/>
       </w:sdtContent>
     </w:sdt>
     <w:p>
       <w:pPr>
         <w:pStyle w:val="Ttulo1"/>
-        <w:numPr>
-          <w:ilvl w:val="0"/>
-          <w:numId w:val="27"/>
-        </w:numPr>
-        <w:rPr>
-          <w:rFonts w:asciiTheme="minorHAnsi" w:hAnsiTheme="minorHAnsi"/>
-          <w:sz w:val="24"/>
-          <w:szCs w:val="24"/>
+        <w:rPr>
+          <w:sz w:val="40"/>
+          <w:szCs w:val="40"/>
+          <w:lang w:val="es-CO"/>
         </w:rPr>
       </w:pPr>
       <w:bookmarkStart w:id="2" w:name="_Toc32470"/>
@@ -2423,13 +2419,1356 @@
       <w:bookmarkStart w:id="4" w:name="_Toc28032"/>
       <w:bookmarkStart w:id="5" w:name="_Toc198105238"/>
       <w:bookmarkStart w:id="6" w:name="_Toc198141113"/>
+      <w:proofErr w:type="spellStart"/>
       <w:r>
+        <w:lastRenderedPageBreak/>
+        <w:t>Tabla</w:t>
+      </w:r>
+      <w:proofErr w:type="spellEnd"/>
+      <w:r>
+        <w:t xml:space="preserve"> de </w:t>
+      </w:r>
+      <w:proofErr w:type="spellStart"/>
+      <w:r>
+        <w:t>versionamiento</w:t>
+      </w:r>
+      <w:proofErr w:type="spellEnd"/>
+    </w:p>
+    <w:tbl>
+      <w:tblPr>
+        <w:tblStyle w:val="Tablaconcuadrcula"/>
+        <w:tblW w:w="0" w:type="auto"/>
+        <w:tblLook w:val="04A0" w:firstRow="1" w:lastRow="0" w:firstColumn="1" w:lastColumn="0" w:noHBand="0" w:noVBand="1"/>
+      </w:tblPr>
+      <w:tblGrid>
+        <w:gridCol w:w="1951"/>
+        <w:gridCol w:w="4536"/>
+      </w:tblGrid>
+      <w:tr>
+        <w:tc>
+          <w:tcPr>
+            <w:tcW w:w="1951" w:type="dxa"/>
+            <w:tcBorders>
+              <w:top w:val="single" w:sz="4" w:space="0" w:color="auto"/>
+              <w:left w:val="single" w:sz="4" w:space="0" w:color="auto"/>
+              <w:bottom w:val="single" w:sz="4" w:space="0" w:color="auto"/>
+              <w:right w:val="single" w:sz="4" w:space="0" w:color="auto"/>
+            </w:tcBorders>
+            <w:hideMark/>
+          </w:tcPr>
+          <w:p>
+            <w:pPr>
+              <w:spacing w:after="0" w:line="240" w:lineRule="auto"/>
+              <w:rPr>
+                <w:b/>
+                <w:bCs/>
+              </w:rPr>
+            </w:pPr>
+            <w:r>
+              <w:rPr>
+                <w:b/>
+                <w:bCs/>
+              </w:rPr>
+              <w:t>PROYECTO</w:t>
+            </w:r>
+          </w:p>
+        </w:tc>
+        <w:tc>
+          <w:tcPr>
+            <w:tcW w:w="4536" w:type="dxa"/>
+            <w:tcBorders>
+              <w:top w:val="single" w:sz="4" w:space="0" w:color="auto"/>
+              <w:left w:val="single" w:sz="4" w:space="0" w:color="auto"/>
+              <w:bottom w:val="single" w:sz="4" w:space="0" w:color="auto"/>
+              <w:right w:val="single" w:sz="4" w:space="0" w:color="auto"/>
+            </w:tcBorders>
+            <w:hideMark/>
+          </w:tcPr>
+          <w:p>
+            <w:pPr>
+              <w:spacing w:after="0" w:line="240" w:lineRule="auto"/>
+            </w:pPr>
+            <w:r>
+              <w:t>VETERINARIA CIUDAD CANINA</w:t>
+            </w:r>
+          </w:p>
+        </w:tc>
+      </w:tr>
+      <w:tr>
+        <w:tc>
+          <w:tcPr>
+            <w:tcW w:w="1951" w:type="dxa"/>
+            <w:tcBorders>
+              <w:top w:val="single" w:sz="4" w:space="0" w:color="auto"/>
+              <w:left w:val="single" w:sz="4" w:space="0" w:color="auto"/>
+              <w:bottom w:val="single" w:sz="4" w:space="0" w:color="auto"/>
+              <w:right w:val="single" w:sz="4" w:space="0" w:color="auto"/>
+            </w:tcBorders>
+            <w:hideMark/>
+          </w:tcPr>
+          <w:p>
+            <w:pPr>
+              <w:spacing w:after="0" w:line="240" w:lineRule="auto"/>
+              <w:rPr>
+                <w:b/>
+                <w:bCs/>
+              </w:rPr>
+            </w:pPr>
+            <w:r>
+              <w:rPr>
+                <w:b/>
+                <w:bCs/>
+              </w:rPr>
+              <w:t>DOCUMENTO</w:t>
+            </w:r>
+          </w:p>
+        </w:tc>
+        <w:tc>
+          <w:tcPr>
+            <w:tcW w:w="4536" w:type="dxa"/>
+            <w:tcBorders>
+              <w:top w:val="single" w:sz="4" w:space="0" w:color="auto"/>
+              <w:left w:val="single" w:sz="4" w:space="0" w:color="auto"/>
+              <w:bottom w:val="single" w:sz="4" w:space="0" w:color="auto"/>
+              <w:right w:val="single" w:sz="4" w:space="0" w:color="auto"/>
+            </w:tcBorders>
+            <w:hideMark/>
+          </w:tcPr>
+          <w:p>
+            <w:pPr>
+              <w:spacing w:after="0" w:line="240" w:lineRule="auto"/>
+            </w:pPr>
+            <w:r>
+              <w:t xml:space="preserve">Manual de </w:t>
+            </w:r>
+            <w:proofErr w:type="spellStart"/>
+            <w:r>
+              <w:t>inst</w:t>
+            </w:r>
+            <w:bookmarkStart w:id="7" w:name="_GoBack"/>
+            <w:bookmarkEnd w:id="7"/>
+            <w:r>
+              <w:t>alación</w:t>
+            </w:r>
+            <w:proofErr w:type="spellEnd"/>
+          </w:p>
+        </w:tc>
+      </w:tr>
+      <w:tr>
+        <w:tc>
+          <w:tcPr>
+            <w:tcW w:w="1951" w:type="dxa"/>
+            <w:tcBorders>
+              <w:top w:val="single" w:sz="4" w:space="0" w:color="auto"/>
+              <w:left w:val="single" w:sz="4" w:space="0" w:color="auto"/>
+              <w:bottom w:val="single" w:sz="4" w:space="0" w:color="auto"/>
+              <w:right w:val="single" w:sz="4" w:space="0" w:color="auto"/>
+            </w:tcBorders>
+            <w:hideMark/>
+          </w:tcPr>
+          <w:p>
+            <w:pPr>
+              <w:spacing w:after="0" w:line="240" w:lineRule="auto"/>
+              <w:rPr>
+                <w:b/>
+                <w:bCs/>
+              </w:rPr>
+            </w:pPr>
+            <w:r>
+              <w:rPr>
+                <w:b/>
+                <w:bCs/>
+              </w:rPr>
+              <w:t>VERSIÓN</w:t>
+            </w:r>
+          </w:p>
+        </w:tc>
+        <w:tc>
+          <w:tcPr>
+            <w:tcW w:w="4536" w:type="dxa"/>
+            <w:tcBorders>
+              <w:top w:val="single" w:sz="4" w:space="0" w:color="auto"/>
+              <w:left w:val="single" w:sz="4" w:space="0" w:color="auto"/>
+              <w:bottom w:val="single" w:sz="4" w:space="0" w:color="auto"/>
+              <w:right w:val="single" w:sz="4" w:space="0" w:color="auto"/>
+            </w:tcBorders>
+            <w:hideMark/>
+          </w:tcPr>
+          <w:p>
+            <w:pPr>
+              <w:spacing w:after="0" w:line="240" w:lineRule="auto"/>
+            </w:pPr>
+            <w:r>
+              <w:t>1.0</w:t>
+            </w:r>
+          </w:p>
+        </w:tc>
+      </w:tr>
+      <w:tr>
+        <w:tc>
+          <w:tcPr>
+            <w:tcW w:w="1951" w:type="dxa"/>
+            <w:tcBorders>
+              <w:top w:val="single" w:sz="4" w:space="0" w:color="auto"/>
+              <w:left w:val="single" w:sz="4" w:space="0" w:color="auto"/>
+              <w:bottom w:val="single" w:sz="4" w:space="0" w:color="auto"/>
+              <w:right w:val="single" w:sz="4" w:space="0" w:color="auto"/>
+            </w:tcBorders>
+            <w:hideMark/>
+          </w:tcPr>
+          <w:p>
+            <w:pPr>
+              <w:spacing w:after="0" w:line="240" w:lineRule="auto"/>
+              <w:rPr>
+                <w:b/>
+                <w:bCs/>
+              </w:rPr>
+            </w:pPr>
+            <w:r>
+              <w:rPr>
+                <w:b/>
+                <w:bCs/>
+              </w:rPr>
+              <w:t xml:space="preserve">FECHA CREACIÓN </w:t>
+            </w:r>
+          </w:p>
+        </w:tc>
+        <w:tc>
+          <w:tcPr>
+            <w:tcW w:w="4536" w:type="dxa"/>
+            <w:tcBorders>
+              <w:top w:val="single" w:sz="4" w:space="0" w:color="auto"/>
+              <w:left w:val="single" w:sz="4" w:space="0" w:color="auto"/>
+              <w:bottom w:val="single" w:sz="4" w:space="0" w:color="auto"/>
+              <w:right w:val="single" w:sz="4" w:space="0" w:color="auto"/>
+            </w:tcBorders>
+            <w:hideMark/>
+          </w:tcPr>
+          <w:p>
+            <w:pPr>
+              <w:spacing w:after="0" w:line="240" w:lineRule="auto"/>
+            </w:pPr>
+            <w:r>
+              <w:t>12/05/2025</w:t>
+            </w:r>
+          </w:p>
+        </w:tc>
+      </w:tr>
+      <w:tr>
+        <w:tc>
+          <w:tcPr>
+            <w:tcW w:w="1951" w:type="dxa"/>
+            <w:tcBorders>
+              <w:top w:val="single" w:sz="4" w:space="0" w:color="auto"/>
+              <w:left w:val="single" w:sz="4" w:space="0" w:color="auto"/>
+              <w:bottom w:val="single" w:sz="4" w:space="0" w:color="auto"/>
+              <w:right w:val="single" w:sz="4" w:space="0" w:color="auto"/>
+            </w:tcBorders>
+            <w:hideMark/>
+          </w:tcPr>
+          <w:p>
+            <w:pPr>
+              <w:spacing w:after="0" w:line="240" w:lineRule="auto"/>
+              <w:rPr>
+                <w:b/>
+                <w:bCs/>
+              </w:rPr>
+            </w:pPr>
+            <w:r>
+              <w:rPr>
+                <w:b/>
+                <w:bCs/>
+              </w:rPr>
+              <w:t xml:space="preserve">FECHA CAMBIO </w:t>
+            </w:r>
+          </w:p>
+        </w:tc>
+        <w:tc>
+          <w:tcPr>
+            <w:tcW w:w="4536" w:type="dxa"/>
+            <w:tcBorders>
+              <w:top w:val="single" w:sz="4" w:space="0" w:color="auto"/>
+              <w:left w:val="single" w:sz="4" w:space="0" w:color="auto"/>
+              <w:bottom w:val="single" w:sz="4" w:space="0" w:color="auto"/>
+              <w:right w:val="single" w:sz="4" w:space="0" w:color="auto"/>
+            </w:tcBorders>
+            <w:hideMark/>
+          </w:tcPr>
+          <w:p>
+            <w:pPr>
+              <w:spacing w:after="0" w:line="240" w:lineRule="auto"/>
+            </w:pPr>
+            <w:r>
+              <w:t>14/05/2025</w:t>
+            </w:r>
+          </w:p>
+        </w:tc>
+      </w:tr>
+      <w:tr>
+        <w:tc>
+          <w:tcPr>
+            <w:tcW w:w="1951" w:type="dxa"/>
+            <w:tcBorders>
+              <w:top w:val="single" w:sz="4" w:space="0" w:color="auto"/>
+              <w:left w:val="single" w:sz="4" w:space="0" w:color="auto"/>
+              <w:bottom w:val="single" w:sz="4" w:space="0" w:color="auto"/>
+              <w:right w:val="single" w:sz="4" w:space="0" w:color="auto"/>
+            </w:tcBorders>
+            <w:hideMark/>
+          </w:tcPr>
+          <w:p>
+            <w:pPr>
+              <w:spacing w:after="0" w:line="240" w:lineRule="auto"/>
+              <w:rPr>
+                <w:b/>
+                <w:bCs/>
+              </w:rPr>
+            </w:pPr>
+            <w:r>
+              <w:rPr>
+                <w:b/>
+                <w:bCs/>
+              </w:rPr>
+              <w:t>RESPONSABLES</w:t>
+            </w:r>
+          </w:p>
+        </w:tc>
+        <w:tc>
+          <w:tcPr>
+            <w:tcW w:w="4536" w:type="dxa"/>
+            <w:tcBorders>
+              <w:top w:val="single" w:sz="4" w:space="0" w:color="auto"/>
+              <w:left w:val="single" w:sz="4" w:space="0" w:color="auto"/>
+              <w:bottom w:val="single" w:sz="4" w:space="0" w:color="auto"/>
+              <w:right w:val="single" w:sz="4" w:space="0" w:color="auto"/>
+            </w:tcBorders>
+          </w:tcPr>
+          <w:p>
+            <w:pPr>
+              <w:spacing w:after="0" w:line="240" w:lineRule="auto"/>
+            </w:pPr>
+            <w:r>
+              <w:t>Martin Lee Moya Llano</w:t>
+            </w:r>
+          </w:p>
+          <w:p>
+            <w:pPr>
+              <w:spacing w:after="0" w:line="240" w:lineRule="auto"/>
+            </w:pPr>
+          </w:p>
+          <w:p>
+            <w:pPr>
+              <w:spacing w:after="0" w:line="240" w:lineRule="auto"/>
+            </w:pPr>
+            <w:r>
+              <w:t xml:space="preserve">Diego Esteban Sánchez </w:t>
+            </w:r>
+            <w:proofErr w:type="spellStart"/>
+            <w:r>
+              <w:t>Forero</w:t>
+            </w:r>
+            <w:proofErr w:type="spellEnd"/>
+          </w:p>
+          <w:p>
+            <w:pPr>
+              <w:spacing w:after="0" w:line="240" w:lineRule="auto"/>
+            </w:pPr>
+          </w:p>
+          <w:p>
+            <w:pPr>
+              <w:spacing w:after="0" w:line="240" w:lineRule="auto"/>
+            </w:pPr>
+            <w:r>
+              <w:t>Alisson Daniela Torres Romero</w:t>
+            </w:r>
+          </w:p>
+          <w:p>
+            <w:pPr>
+              <w:spacing w:after="0" w:line="240" w:lineRule="auto"/>
+            </w:pPr>
+          </w:p>
+          <w:p>
+            <w:pPr>
+              <w:spacing w:after="0" w:line="240" w:lineRule="auto"/>
+            </w:pPr>
+            <w:r>
+              <w:t xml:space="preserve">Juan José </w:t>
+            </w:r>
+            <w:proofErr w:type="spellStart"/>
+            <w:r>
+              <w:t>Uparela</w:t>
+            </w:r>
+            <w:proofErr w:type="spellEnd"/>
+            <w:r>
+              <w:t xml:space="preserve"> Sosa</w:t>
+            </w:r>
+          </w:p>
+        </w:tc>
+      </w:tr>
+      <w:tr>
+        <w:tc>
+          <w:tcPr>
+            <w:tcW w:w="1951" w:type="dxa"/>
+            <w:tcBorders>
+              <w:top w:val="single" w:sz="4" w:space="0" w:color="auto"/>
+              <w:left w:val="single" w:sz="4" w:space="0" w:color="auto"/>
+              <w:bottom w:val="single" w:sz="4" w:space="0" w:color="auto"/>
+              <w:right w:val="single" w:sz="4" w:space="0" w:color="auto"/>
+            </w:tcBorders>
+            <w:hideMark/>
+          </w:tcPr>
+          <w:p>
+            <w:pPr>
+              <w:spacing w:after="0" w:line="240" w:lineRule="auto"/>
+              <w:rPr>
+                <w:b/>
+                <w:bCs/>
+              </w:rPr>
+            </w:pPr>
+            <w:r>
+              <w:rPr>
+                <w:b/>
+                <w:bCs/>
+              </w:rPr>
+              <w:t>LIDER</w:t>
+            </w:r>
+          </w:p>
+        </w:tc>
+        <w:tc>
+          <w:tcPr>
+            <w:tcW w:w="4536" w:type="dxa"/>
+            <w:tcBorders>
+              <w:top w:val="single" w:sz="4" w:space="0" w:color="auto"/>
+              <w:left w:val="single" w:sz="4" w:space="0" w:color="auto"/>
+              <w:bottom w:val="single" w:sz="4" w:space="0" w:color="auto"/>
+              <w:right w:val="single" w:sz="4" w:space="0" w:color="auto"/>
+            </w:tcBorders>
+            <w:hideMark/>
+          </w:tcPr>
+          <w:p>
+            <w:pPr>
+              <w:spacing w:after="0" w:line="240" w:lineRule="auto"/>
+            </w:pPr>
+            <w:r>
+              <w:t>Martin Lee Moya Llano</w:t>
+            </w:r>
+          </w:p>
+        </w:tc>
+      </w:tr>
+    </w:tbl>
+    <w:p>
+      <w:pPr>
+        <w:pStyle w:val="Ttulo1"/>
+        <w:rPr>
+          <w:kern w:val="2"/>
+          <w:sz w:val="40"/>
+          <w:szCs w:val="40"/>
+          <w14:ligatures w14:val="standardContextual"/>
+        </w:rPr>
+      </w:pPr>
+    </w:p>
+    <w:tbl>
+      <w:tblPr>
+        <w:tblStyle w:val="Tablaconcuadrcula"/>
+        <w:tblW w:w="0" w:type="auto"/>
+        <w:tblLook w:val="04A0" w:firstRow="1" w:lastRow="0" w:firstColumn="1" w:lastColumn="0" w:noHBand="0" w:noVBand="1"/>
+      </w:tblPr>
+      <w:tblGrid>
+        <w:gridCol w:w="1951"/>
+        <w:gridCol w:w="4536"/>
+      </w:tblGrid>
+      <w:tr>
+        <w:tc>
+          <w:tcPr>
+            <w:tcW w:w="1951" w:type="dxa"/>
+            <w:tcBorders>
+              <w:top w:val="single" w:sz="4" w:space="0" w:color="auto"/>
+              <w:left w:val="single" w:sz="4" w:space="0" w:color="auto"/>
+              <w:bottom w:val="single" w:sz="4" w:space="0" w:color="auto"/>
+              <w:right w:val="single" w:sz="4" w:space="0" w:color="auto"/>
+            </w:tcBorders>
+            <w:hideMark/>
+          </w:tcPr>
+          <w:p>
+            <w:pPr>
+              <w:spacing w:after="0" w:line="240" w:lineRule="auto"/>
+              <w:rPr>
+                <w:b/>
+                <w:bCs/>
+              </w:rPr>
+            </w:pPr>
+            <w:r>
+              <w:rPr>
+                <w:b/>
+                <w:bCs/>
+              </w:rPr>
+              <w:t>PROYECTO</w:t>
+            </w:r>
+          </w:p>
+        </w:tc>
+        <w:tc>
+          <w:tcPr>
+            <w:tcW w:w="4536" w:type="dxa"/>
+            <w:tcBorders>
+              <w:top w:val="single" w:sz="4" w:space="0" w:color="auto"/>
+              <w:left w:val="single" w:sz="4" w:space="0" w:color="auto"/>
+              <w:bottom w:val="single" w:sz="4" w:space="0" w:color="auto"/>
+              <w:right w:val="single" w:sz="4" w:space="0" w:color="auto"/>
+            </w:tcBorders>
+            <w:hideMark/>
+          </w:tcPr>
+          <w:p>
+            <w:pPr>
+              <w:spacing w:after="0" w:line="240" w:lineRule="auto"/>
+            </w:pPr>
+            <w:r>
+              <w:t>VETERINARIA CIUDAD CANINA</w:t>
+            </w:r>
+          </w:p>
+        </w:tc>
+      </w:tr>
+      <w:tr>
+        <w:tc>
+          <w:tcPr>
+            <w:tcW w:w="1951" w:type="dxa"/>
+            <w:tcBorders>
+              <w:top w:val="single" w:sz="4" w:space="0" w:color="auto"/>
+              <w:left w:val="single" w:sz="4" w:space="0" w:color="auto"/>
+              <w:bottom w:val="single" w:sz="4" w:space="0" w:color="auto"/>
+              <w:right w:val="single" w:sz="4" w:space="0" w:color="auto"/>
+            </w:tcBorders>
+            <w:hideMark/>
+          </w:tcPr>
+          <w:p>
+            <w:pPr>
+              <w:spacing w:after="0" w:line="240" w:lineRule="auto"/>
+              <w:rPr>
+                <w:b/>
+                <w:bCs/>
+              </w:rPr>
+            </w:pPr>
+            <w:r>
+              <w:rPr>
+                <w:b/>
+                <w:bCs/>
+              </w:rPr>
+              <w:t>DOCUMENTO</w:t>
+            </w:r>
+          </w:p>
+        </w:tc>
+        <w:tc>
+          <w:tcPr>
+            <w:tcW w:w="4536" w:type="dxa"/>
+            <w:tcBorders>
+              <w:top w:val="single" w:sz="4" w:space="0" w:color="auto"/>
+              <w:left w:val="single" w:sz="4" w:space="0" w:color="auto"/>
+              <w:bottom w:val="single" w:sz="4" w:space="0" w:color="auto"/>
+              <w:right w:val="single" w:sz="4" w:space="0" w:color="auto"/>
+            </w:tcBorders>
+            <w:hideMark/>
+          </w:tcPr>
+          <w:p>
+            <w:pPr>
+              <w:spacing w:after="0" w:line="240" w:lineRule="auto"/>
+            </w:pPr>
+            <w:r>
+              <w:t xml:space="preserve">Manual de </w:t>
+            </w:r>
+            <w:proofErr w:type="spellStart"/>
+            <w:r>
+              <w:t>instalación</w:t>
+            </w:r>
+            <w:proofErr w:type="spellEnd"/>
+            <w:r>
+              <w:t xml:space="preserve"> </w:t>
+            </w:r>
+          </w:p>
+        </w:tc>
+      </w:tr>
+      <w:tr>
+        <w:tc>
+          <w:tcPr>
+            <w:tcW w:w="1951" w:type="dxa"/>
+            <w:tcBorders>
+              <w:top w:val="single" w:sz="4" w:space="0" w:color="auto"/>
+              <w:left w:val="single" w:sz="4" w:space="0" w:color="auto"/>
+              <w:bottom w:val="single" w:sz="4" w:space="0" w:color="auto"/>
+              <w:right w:val="single" w:sz="4" w:space="0" w:color="auto"/>
+            </w:tcBorders>
+            <w:hideMark/>
+          </w:tcPr>
+          <w:p>
+            <w:pPr>
+              <w:spacing w:after="0" w:line="240" w:lineRule="auto"/>
+              <w:rPr>
+                <w:b/>
+                <w:bCs/>
+              </w:rPr>
+            </w:pPr>
+            <w:r>
+              <w:rPr>
+                <w:b/>
+                <w:bCs/>
+              </w:rPr>
+              <w:t>VERSIÓN</w:t>
+            </w:r>
+          </w:p>
+        </w:tc>
+        <w:tc>
+          <w:tcPr>
+            <w:tcW w:w="4536" w:type="dxa"/>
+            <w:tcBorders>
+              <w:top w:val="single" w:sz="4" w:space="0" w:color="auto"/>
+              <w:left w:val="single" w:sz="4" w:space="0" w:color="auto"/>
+              <w:bottom w:val="single" w:sz="4" w:space="0" w:color="auto"/>
+              <w:right w:val="single" w:sz="4" w:space="0" w:color="auto"/>
+            </w:tcBorders>
+            <w:hideMark/>
+          </w:tcPr>
+          <w:p>
+            <w:pPr>
+              <w:spacing w:after="0" w:line="240" w:lineRule="auto"/>
+            </w:pPr>
+            <w:r>
+              <w:t>1.2</w:t>
+            </w:r>
+          </w:p>
+        </w:tc>
+      </w:tr>
+      <w:tr>
+        <w:tc>
+          <w:tcPr>
+            <w:tcW w:w="1951" w:type="dxa"/>
+            <w:tcBorders>
+              <w:top w:val="single" w:sz="4" w:space="0" w:color="auto"/>
+              <w:left w:val="single" w:sz="4" w:space="0" w:color="auto"/>
+              <w:bottom w:val="single" w:sz="4" w:space="0" w:color="auto"/>
+              <w:right w:val="single" w:sz="4" w:space="0" w:color="auto"/>
+            </w:tcBorders>
+            <w:hideMark/>
+          </w:tcPr>
+          <w:p>
+            <w:pPr>
+              <w:spacing w:after="0" w:line="240" w:lineRule="auto"/>
+              <w:rPr>
+                <w:b/>
+                <w:bCs/>
+              </w:rPr>
+            </w:pPr>
+            <w:r>
+              <w:rPr>
+                <w:b/>
+                <w:bCs/>
+              </w:rPr>
+              <w:t xml:space="preserve">FECHA CREACIÓN </w:t>
+            </w:r>
+          </w:p>
+        </w:tc>
+        <w:tc>
+          <w:tcPr>
+            <w:tcW w:w="4536" w:type="dxa"/>
+            <w:tcBorders>
+              <w:top w:val="single" w:sz="4" w:space="0" w:color="auto"/>
+              <w:left w:val="single" w:sz="4" w:space="0" w:color="auto"/>
+              <w:bottom w:val="single" w:sz="4" w:space="0" w:color="auto"/>
+              <w:right w:val="single" w:sz="4" w:space="0" w:color="auto"/>
+            </w:tcBorders>
+            <w:hideMark/>
+          </w:tcPr>
+          <w:p>
+            <w:pPr>
+              <w:spacing w:after="0" w:line="240" w:lineRule="auto"/>
+            </w:pPr>
+            <w:r>
+              <w:t>12/05/2025</w:t>
+            </w:r>
+          </w:p>
+        </w:tc>
+      </w:tr>
+      <w:tr>
+        <w:tc>
+          <w:tcPr>
+            <w:tcW w:w="1951" w:type="dxa"/>
+            <w:tcBorders>
+              <w:top w:val="single" w:sz="4" w:space="0" w:color="auto"/>
+              <w:left w:val="single" w:sz="4" w:space="0" w:color="auto"/>
+              <w:bottom w:val="single" w:sz="4" w:space="0" w:color="auto"/>
+              <w:right w:val="single" w:sz="4" w:space="0" w:color="auto"/>
+            </w:tcBorders>
+            <w:hideMark/>
+          </w:tcPr>
+          <w:p>
+            <w:pPr>
+              <w:spacing w:after="0" w:line="240" w:lineRule="auto"/>
+              <w:rPr>
+                <w:b/>
+                <w:bCs/>
+              </w:rPr>
+            </w:pPr>
+            <w:r>
+              <w:rPr>
+                <w:b/>
+                <w:bCs/>
+              </w:rPr>
+              <w:t xml:space="preserve">FECHA CAMBIO </w:t>
+            </w:r>
+          </w:p>
+        </w:tc>
+        <w:tc>
+          <w:tcPr>
+            <w:tcW w:w="4536" w:type="dxa"/>
+            <w:tcBorders>
+              <w:top w:val="single" w:sz="4" w:space="0" w:color="auto"/>
+              <w:left w:val="single" w:sz="4" w:space="0" w:color="auto"/>
+              <w:bottom w:val="single" w:sz="4" w:space="0" w:color="auto"/>
+              <w:right w:val="single" w:sz="4" w:space="0" w:color="auto"/>
+            </w:tcBorders>
+            <w:hideMark/>
+          </w:tcPr>
+          <w:p>
+            <w:pPr>
+              <w:spacing w:after="0" w:line="240" w:lineRule="auto"/>
+            </w:pPr>
+            <w:r>
+              <w:t>30/05/2025</w:t>
+            </w:r>
+          </w:p>
+        </w:tc>
+      </w:tr>
+      <w:tr>
+        <w:tc>
+          <w:tcPr>
+            <w:tcW w:w="1951" w:type="dxa"/>
+            <w:tcBorders>
+              <w:top w:val="single" w:sz="4" w:space="0" w:color="auto"/>
+              <w:left w:val="single" w:sz="4" w:space="0" w:color="auto"/>
+              <w:bottom w:val="single" w:sz="4" w:space="0" w:color="auto"/>
+              <w:right w:val="single" w:sz="4" w:space="0" w:color="auto"/>
+            </w:tcBorders>
+            <w:hideMark/>
+          </w:tcPr>
+          <w:p>
+            <w:pPr>
+              <w:spacing w:after="0" w:line="240" w:lineRule="auto"/>
+              <w:rPr>
+                <w:b/>
+                <w:bCs/>
+              </w:rPr>
+            </w:pPr>
+            <w:r>
+              <w:rPr>
+                <w:b/>
+                <w:bCs/>
+              </w:rPr>
+              <w:t>RESPONSABLES</w:t>
+            </w:r>
+          </w:p>
+        </w:tc>
+        <w:tc>
+          <w:tcPr>
+            <w:tcW w:w="4536" w:type="dxa"/>
+            <w:tcBorders>
+              <w:top w:val="single" w:sz="4" w:space="0" w:color="auto"/>
+              <w:left w:val="single" w:sz="4" w:space="0" w:color="auto"/>
+              <w:bottom w:val="single" w:sz="4" w:space="0" w:color="auto"/>
+              <w:right w:val="single" w:sz="4" w:space="0" w:color="auto"/>
+            </w:tcBorders>
+          </w:tcPr>
+          <w:p>
+            <w:pPr>
+              <w:spacing w:after="0" w:line="240" w:lineRule="auto"/>
+            </w:pPr>
+            <w:r>
+              <w:t>Martin Lee Moya Llano</w:t>
+            </w:r>
+          </w:p>
+          <w:p>
+            <w:pPr>
+              <w:spacing w:after="0" w:line="240" w:lineRule="auto"/>
+            </w:pPr>
+          </w:p>
+          <w:p>
+            <w:pPr>
+              <w:spacing w:after="0" w:line="240" w:lineRule="auto"/>
+            </w:pPr>
+            <w:r>
+              <w:t xml:space="preserve">Diego Esteban Sánchez </w:t>
+            </w:r>
+            <w:proofErr w:type="spellStart"/>
+            <w:r>
+              <w:t>Forero</w:t>
+            </w:r>
+            <w:proofErr w:type="spellEnd"/>
+          </w:p>
+          <w:p>
+            <w:pPr>
+              <w:spacing w:after="0" w:line="240" w:lineRule="auto"/>
+            </w:pPr>
+          </w:p>
+          <w:p>
+            <w:pPr>
+              <w:spacing w:after="0" w:line="240" w:lineRule="auto"/>
+            </w:pPr>
+            <w:r>
+              <w:t>Alisson Daniela Torres Romero</w:t>
+            </w:r>
+          </w:p>
+          <w:p>
+            <w:pPr>
+              <w:spacing w:after="0" w:line="240" w:lineRule="auto"/>
+            </w:pPr>
+          </w:p>
+          <w:p>
+            <w:pPr>
+              <w:spacing w:after="0" w:line="240" w:lineRule="auto"/>
+            </w:pPr>
+            <w:r>
+              <w:t xml:space="preserve">Juan José </w:t>
+            </w:r>
+            <w:proofErr w:type="spellStart"/>
+            <w:r>
+              <w:t>Uparela</w:t>
+            </w:r>
+            <w:proofErr w:type="spellEnd"/>
+            <w:r>
+              <w:t xml:space="preserve"> Sosa</w:t>
+            </w:r>
+          </w:p>
+        </w:tc>
+      </w:tr>
+      <w:tr>
+        <w:tc>
+          <w:tcPr>
+            <w:tcW w:w="1951" w:type="dxa"/>
+            <w:tcBorders>
+              <w:top w:val="single" w:sz="4" w:space="0" w:color="auto"/>
+              <w:left w:val="single" w:sz="4" w:space="0" w:color="auto"/>
+              <w:bottom w:val="single" w:sz="4" w:space="0" w:color="auto"/>
+              <w:right w:val="single" w:sz="4" w:space="0" w:color="auto"/>
+            </w:tcBorders>
+            <w:hideMark/>
+          </w:tcPr>
+          <w:p>
+            <w:pPr>
+              <w:spacing w:after="0" w:line="240" w:lineRule="auto"/>
+              <w:rPr>
+                <w:b/>
+                <w:bCs/>
+              </w:rPr>
+            </w:pPr>
+            <w:r>
+              <w:rPr>
+                <w:b/>
+                <w:bCs/>
+              </w:rPr>
+              <w:t>LIDER</w:t>
+            </w:r>
+          </w:p>
+        </w:tc>
+        <w:tc>
+          <w:tcPr>
+            <w:tcW w:w="4536" w:type="dxa"/>
+            <w:tcBorders>
+              <w:top w:val="single" w:sz="4" w:space="0" w:color="auto"/>
+              <w:left w:val="single" w:sz="4" w:space="0" w:color="auto"/>
+              <w:bottom w:val="single" w:sz="4" w:space="0" w:color="auto"/>
+              <w:right w:val="single" w:sz="4" w:space="0" w:color="auto"/>
+            </w:tcBorders>
+            <w:hideMark/>
+          </w:tcPr>
+          <w:p>
+            <w:pPr>
+              <w:spacing w:after="0" w:line="240" w:lineRule="auto"/>
+            </w:pPr>
+            <w:r>
+              <w:t>Martin Lee Moya Llano</w:t>
+            </w:r>
+          </w:p>
+        </w:tc>
+      </w:tr>
+    </w:tbl>
+    <w:p>
+      <w:pPr>
+        <w:pStyle w:val="Ttulo1"/>
+        <w:rPr>
+          <w:kern w:val="2"/>
+          <w:sz w:val="40"/>
+          <w:szCs w:val="40"/>
+          <w14:ligatures w14:val="standardContextual"/>
+        </w:rPr>
+      </w:pPr>
+    </w:p>
+    <w:tbl>
+      <w:tblPr>
+        <w:tblStyle w:val="Tablaconcuadrcula"/>
+        <w:tblW w:w="0" w:type="auto"/>
+        <w:tblLook w:val="04A0" w:firstRow="1" w:lastRow="0" w:firstColumn="1" w:lastColumn="0" w:noHBand="0" w:noVBand="1"/>
+      </w:tblPr>
+      <w:tblGrid>
+        <w:gridCol w:w="1951"/>
+        <w:gridCol w:w="4536"/>
+      </w:tblGrid>
+      <w:tr>
+        <w:tc>
+          <w:tcPr>
+            <w:tcW w:w="1951" w:type="dxa"/>
+            <w:tcBorders>
+              <w:top w:val="single" w:sz="4" w:space="0" w:color="auto"/>
+              <w:left w:val="single" w:sz="4" w:space="0" w:color="auto"/>
+              <w:bottom w:val="single" w:sz="4" w:space="0" w:color="auto"/>
+              <w:right w:val="single" w:sz="4" w:space="0" w:color="auto"/>
+            </w:tcBorders>
+            <w:hideMark/>
+          </w:tcPr>
+          <w:p>
+            <w:pPr>
+              <w:spacing w:after="0" w:line="240" w:lineRule="auto"/>
+              <w:rPr>
+                <w:b/>
+                <w:bCs/>
+              </w:rPr>
+            </w:pPr>
+            <w:r>
+              <w:rPr>
+                <w:b/>
+                <w:bCs/>
+              </w:rPr>
+              <w:t>PROYECTO</w:t>
+            </w:r>
+          </w:p>
+        </w:tc>
+        <w:tc>
+          <w:tcPr>
+            <w:tcW w:w="4536" w:type="dxa"/>
+            <w:tcBorders>
+              <w:top w:val="single" w:sz="4" w:space="0" w:color="auto"/>
+              <w:left w:val="single" w:sz="4" w:space="0" w:color="auto"/>
+              <w:bottom w:val="single" w:sz="4" w:space="0" w:color="auto"/>
+              <w:right w:val="single" w:sz="4" w:space="0" w:color="auto"/>
+            </w:tcBorders>
+            <w:hideMark/>
+          </w:tcPr>
+          <w:p>
+            <w:pPr>
+              <w:spacing w:after="0" w:line="240" w:lineRule="auto"/>
+            </w:pPr>
+            <w:r>
+              <w:t>VETERINARIA CIUDAD CANINA</w:t>
+            </w:r>
+          </w:p>
+        </w:tc>
+      </w:tr>
+      <w:tr>
+        <w:tc>
+          <w:tcPr>
+            <w:tcW w:w="1951" w:type="dxa"/>
+            <w:tcBorders>
+              <w:top w:val="single" w:sz="4" w:space="0" w:color="auto"/>
+              <w:left w:val="single" w:sz="4" w:space="0" w:color="auto"/>
+              <w:bottom w:val="single" w:sz="4" w:space="0" w:color="auto"/>
+              <w:right w:val="single" w:sz="4" w:space="0" w:color="auto"/>
+            </w:tcBorders>
+            <w:hideMark/>
+          </w:tcPr>
+          <w:p>
+            <w:pPr>
+              <w:spacing w:after="0" w:line="240" w:lineRule="auto"/>
+              <w:rPr>
+                <w:b/>
+                <w:bCs/>
+              </w:rPr>
+            </w:pPr>
+            <w:r>
+              <w:rPr>
+                <w:b/>
+                <w:bCs/>
+              </w:rPr>
+              <w:t>DOCUMENTO</w:t>
+            </w:r>
+          </w:p>
+        </w:tc>
+        <w:tc>
+          <w:tcPr>
+            <w:tcW w:w="4536" w:type="dxa"/>
+            <w:tcBorders>
+              <w:top w:val="single" w:sz="4" w:space="0" w:color="auto"/>
+              <w:left w:val="single" w:sz="4" w:space="0" w:color="auto"/>
+              <w:bottom w:val="single" w:sz="4" w:space="0" w:color="auto"/>
+              <w:right w:val="single" w:sz="4" w:space="0" w:color="auto"/>
+            </w:tcBorders>
+            <w:hideMark/>
+          </w:tcPr>
+          <w:p>
+            <w:pPr>
+              <w:spacing w:after="0" w:line="240" w:lineRule="auto"/>
+            </w:pPr>
+            <w:r>
+              <w:t xml:space="preserve">Manual de </w:t>
+            </w:r>
+            <w:proofErr w:type="spellStart"/>
+            <w:r>
+              <w:t>instalación</w:t>
+            </w:r>
+            <w:proofErr w:type="spellEnd"/>
+          </w:p>
+        </w:tc>
+      </w:tr>
+      <w:tr>
+        <w:tc>
+          <w:tcPr>
+            <w:tcW w:w="1951" w:type="dxa"/>
+            <w:tcBorders>
+              <w:top w:val="single" w:sz="4" w:space="0" w:color="auto"/>
+              <w:left w:val="single" w:sz="4" w:space="0" w:color="auto"/>
+              <w:bottom w:val="single" w:sz="4" w:space="0" w:color="auto"/>
+              <w:right w:val="single" w:sz="4" w:space="0" w:color="auto"/>
+            </w:tcBorders>
+            <w:hideMark/>
+          </w:tcPr>
+          <w:p>
+            <w:pPr>
+              <w:spacing w:after="0" w:line="240" w:lineRule="auto"/>
+              <w:rPr>
+                <w:b/>
+                <w:bCs/>
+              </w:rPr>
+            </w:pPr>
+            <w:r>
+              <w:rPr>
+                <w:b/>
+                <w:bCs/>
+              </w:rPr>
+              <w:t>VERSIÓN</w:t>
+            </w:r>
+          </w:p>
+        </w:tc>
+        <w:tc>
+          <w:tcPr>
+            <w:tcW w:w="4536" w:type="dxa"/>
+            <w:tcBorders>
+              <w:top w:val="single" w:sz="4" w:space="0" w:color="auto"/>
+              <w:left w:val="single" w:sz="4" w:space="0" w:color="auto"/>
+              <w:bottom w:val="single" w:sz="4" w:space="0" w:color="auto"/>
+              <w:right w:val="single" w:sz="4" w:space="0" w:color="auto"/>
+            </w:tcBorders>
+            <w:hideMark/>
+          </w:tcPr>
+          <w:p>
+            <w:pPr>
+              <w:spacing w:after="0" w:line="240" w:lineRule="auto"/>
+            </w:pPr>
+            <w:r>
+              <w:t>1.3</w:t>
+            </w:r>
+          </w:p>
+        </w:tc>
+      </w:tr>
+      <w:tr>
+        <w:tc>
+          <w:tcPr>
+            <w:tcW w:w="1951" w:type="dxa"/>
+            <w:tcBorders>
+              <w:top w:val="single" w:sz="4" w:space="0" w:color="auto"/>
+              <w:left w:val="single" w:sz="4" w:space="0" w:color="auto"/>
+              <w:bottom w:val="single" w:sz="4" w:space="0" w:color="auto"/>
+              <w:right w:val="single" w:sz="4" w:space="0" w:color="auto"/>
+            </w:tcBorders>
+            <w:hideMark/>
+          </w:tcPr>
+          <w:p>
+            <w:pPr>
+              <w:spacing w:after="0" w:line="240" w:lineRule="auto"/>
+              <w:rPr>
+                <w:b/>
+                <w:bCs/>
+              </w:rPr>
+            </w:pPr>
+            <w:r>
+              <w:rPr>
+                <w:b/>
+                <w:bCs/>
+              </w:rPr>
+              <w:t xml:space="preserve">FECHA CREACIÓN </w:t>
+            </w:r>
+          </w:p>
+        </w:tc>
+        <w:tc>
+          <w:tcPr>
+            <w:tcW w:w="4536" w:type="dxa"/>
+            <w:tcBorders>
+              <w:top w:val="single" w:sz="4" w:space="0" w:color="auto"/>
+              <w:left w:val="single" w:sz="4" w:space="0" w:color="auto"/>
+              <w:bottom w:val="single" w:sz="4" w:space="0" w:color="auto"/>
+              <w:right w:val="single" w:sz="4" w:space="0" w:color="auto"/>
+            </w:tcBorders>
+            <w:hideMark/>
+          </w:tcPr>
+          <w:p>
+            <w:pPr>
+              <w:spacing w:after="0" w:line="240" w:lineRule="auto"/>
+            </w:pPr>
+            <w:r>
+              <w:t>12/05/2025</w:t>
+            </w:r>
+          </w:p>
+        </w:tc>
+      </w:tr>
+      <w:tr>
+        <w:tc>
+          <w:tcPr>
+            <w:tcW w:w="1951" w:type="dxa"/>
+            <w:tcBorders>
+              <w:top w:val="single" w:sz="4" w:space="0" w:color="auto"/>
+              <w:left w:val="single" w:sz="4" w:space="0" w:color="auto"/>
+              <w:bottom w:val="single" w:sz="4" w:space="0" w:color="auto"/>
+              <w:right w:val="single" w:sz="4" w:space="0" w:color="auto"/>
+            </w:tcBorders>
+            <w:hideMark/>
+          </w:tcPr>
+          <w:p>
+            <w:pPr>
+              <w:spacing w:after="0" w:line="240" w:lineRule="auto"/>
+              <w:rPr>
+                <w:b/>
+                <w:bCs/>
+              </w:rPr>
+            </w:pPr>
+            <w:r>
+              <w:rPr>
+                <w:b/>
+                <w:bCs/>
+              </w:rPr>
+              <w:t xml:space="preserve">FECHA CAMBIO </w:t>
+            </w:r>
+          </w:p>
+        </w:tc>
+        <w:tc>
+          <w:tcPr>
+            <w:tcW w:w="4536" w:type="dxa"/>
+            <w:tcBorders>
+              <w:top w:val="single" w:sz="4" w:space="0" w:color="auto"/>
+              <w:left w:val="single" w:sz="4" w:space="0" w:color="auto"/>
+              <w:bottom w:val="single" w:sz="4" w:space="0" w:color="auto"/>
+              <w:right w:val="single" w:sz="4" w:space="0" w:color="auto"/>
+            </w:tcBorders>
+            <w:hideMark/>
+          </w:tcPr>
+          <w:p>
+            <w:pPr>
+              <w:spacing w:after="0" w:line="240" w:lineRule="auto"/>
+            </w:pPr>
+            <w:r>
+              <w:t>02/06/2025</w:t>
+            </w:r>
+          </w:p>
+        </w:tc>
+      </w:tr>
+      <w:tr>
+        <w:tc>
+          <w:tcPr>
+            <w:tcW w:w="1951" w:type="dxa"/>
+            <w:tcBorders>
+              <w:top w:val="single" w:sz="4" w:space="0" w:color="auto"/>
+              <w:left w:val="single" w:sz="4" w:space="0" w:color="auto"/>
+              <w:bottom w:val="single" w:sz="4" w:space="0" w:color="auto"/>
+              <w:right w:val="single" w:sz="4" w:space="0" w:color="auto"/>
+            </w:tcBorders>
+            <w:hideMark/>
+          </w:tcPr>
+          <w:p>
+            <w:pPr>
+              <w:spacing w:after="0" w:line="240" w:lineRule="auto"/>
+              <w:rPr>
+                <w:b/>
+                <w:bCs/>
+              </w:rPr>
+            </w:pPr>
+            <w:r>
+              <w:rPr>
+                <w:b/>
+                <w:bCs/>
+              </w:rPr>
+              <w:t>RESPONSABLES</w:t>
+            </w:r>
+          </w:p>
+        </w:tc>
+        <w:tc>
+          <w:tcPr>
+            <w:tcW w:w="4536" w:type="dxa"/>
+            <w:tcBorders>
+              <w:top w:val="single" w:sz="4" w:space="0" w:color="auto"/>
+              <w:left w:val="single" w:sz="4" w:space="0" w:color="auto"/>
+              <w:bottom w:val="single" w:sz="4" w:space="0" w:color="auto"/>
+              <w:right w:val="single" w:sz="4" w:space="0" w:color="auto"/>
+            </w:tcBorders>
+          </w:tcPr>
+          <w:p>
+            <w:pPr>
+              <w:spacing w:after="0" w:line="240" w:lineRule="auto"/>
+            </w:pPr>
+            <w:r>
+              <w:t>Martin Lee Moya Llano</w:t>
+            </w:r>
+          </w:p>
+          <w:p>
+            <w:pPr>
+              <w:spacing w:after="0" w:line="240" w:lineRule="auto"/>
+            </w:pPr>
+          </w:p>
+          <w:p>
+            <w:pPr>
+              <w:spacing w:after="0" w:line="240" w:lineRule="auto"/>
+            </w:pPr>
+            <w:r>
+              <w:t xml:space="preserve">Diego Esteban Sánchez </w:t>
+            </w:r>
+            <w:proofErr w:type="spellStart"/>
+            <w:r>
+              <w:t>Forero</w:t>
+            </w:r>
+            <w:proofErr w:type="spellEnd"/>
+          </w:p>
+          <w:p>
+            <w:pPr>
+              <w:spacing w:after="0" w:line="240" w:lineRule="auto"/>
+            </w:pPr>
+          </w:p>
+          <w:p>
+            <w:pPr>
+              <w:spacing w:after="0" w:line="240" w:lineRule="auto"/>
+            </w:pPr>
+            <w:r>
+              <w:t>Alisson Daniela Torres Romero</w:t>
+            </w:r>
+          </w:p>
+          <w:p>
+            <w:pPr>
+              <w:spacing w:after="0" w:line="240" w:lineRule="auto"/>
+            </w:pPr>
+          </w:p>
+          <w:p>
+            <w:pPr>
+              <w:spacing w:after="0" w:line="240" w:lineRule="auto"/>
+            </w:pPr>
+            <w:r>
+              <w:t xml:space="preserve">Juan José </w:t>
+            </w:r>
+            <w:proofErr w:type="spellStart"/>
+            <w:r>
+              <w:t>Uparela</w:t>
+            </w:r>
+            <w:proofErr w:type="spellEnd"/>
+            <w:r>
+              <w:t xml:space="preserve"> Sosa</w:t>
+            </w:r>
+          </w:p>
+        </w:tc>
+      </w:tr>
+      <w:tr>
+        <w:tc>
+          <w:tcPr>
+            <w:tcW w:w="1951" w:type="dxa"/>
+            <w:tcBorders>
+              <w:top w:val="single" w:sz="4" w:space="0" w:color="auto"/>
+              <w:left w:val="single" w:sz="4" w:space="0" w:color="auto"/>
+              <w:bottom w:val="single" w:sz="4" w:space="0" w:color="auto"/>
+              <w:right w:val="single" w:sz="4" w:space="0" w:color="auto"/>
+            </w:tcBorders>
+            <w:hideMark/>
+          </w:tcPr>
+          <w:p>
+            <w:pPr>
+              <w:spacing w:after="0" w:line="240" w:lineRule="auto"/>
+              <w:rPr>
+                <w:b/>
+                <w:bCs/>
+              </w:rPr>
+            </w:pPr>
+            <w:r>
+              <w:rPr>
+                <w:b/>
+                <w:bCs/>
+              </w:rPr>
+              <w:lastRenderedPageBreak/>
+              <w:t>LIDER</w:t>
+            </w:r>
+          </w:p>
+        </w:tc>
+        <w:tc>
+          <w:tcPr>
+            <w:tcW w:w="4536" w:type="dxa"/>
+            <w:tcBorders>
+              <w:top w:val="single" w:sz="4" w:space="0" w:color="auto"/>
+              <w:left w:val="single" w:sz="4" w:space="0" w:color="auto"/>
+              <w:bottom w:val="single" w:sz="4" w:space="0" w:color="auto"/>
+              <w:right w:val="single" w:sz="4" w:space="0" w:color="auto"/>
+            </w:tcBorders>
+            <w:hideMark/>
+          </w:tcPr>
+          <w:p>
+            <w:pPr>
+              <w:spacing w:after="0" w:line="240" w:lineRule="auto"/>
+            </w:pPr>
+            <w:r>
+              <w:t>Martin Lee Moya Llano</w:t>
+            </w:r>
+          </w:p>
+        </w:tc>
+      </w:tr>
+    </w:tbl>
+    <w:p>
+      <w:pPr>
+        <w:pStyle w:val="Ttulo1"/>
+        <w:ind w:left="360"/>
         <w:rPr>
           <w:rFonts w:asciiTheme="minorHAnsi" w:hAnsiTheme="minorHAnsi"/>
           <w:sz w:val="24"/>
           <w:szCs w:val="24"/>
         </w:rPr>
-        <w:lastRenderedPageBreak/>
+      </w:pPr>
+    </w:p>
+    <w:p>
+      <w:pPr>
+        <w:pStyle w:val="Ttulo1"/>
+        <w:ind w:left="360"/>
+        <w:rPr>
+          <w:rFonts w:asciiTheme="minorHAnsi" w:hAnsiTheme="minorHAnsi"/>
+          <w:sz w:val="24"/>
+          <w:szCs w:val="24"/>
+        </w:rPr>
+      </w:pPr>
+    </w:p>
+    <w:p>
+      <w:pPr>
+        <w:pStyle w:val="Ttulo1"/>
+        <w:ind w:left="360"/>
+        <w:rPr>
+          <w:rFonts w:asciiTheme="minorHAnsi" w:hAnsiTheme="minorHAnsi"/>
+          <w:sz w:val="24"/>
+          <w:szCs w:val="24"/>
+        </w:rPr>
+      </w:pPr>
+    </w:p>
+    <w:p>
+      <w:pPr>
+        <w:pStyle w:val="Ttulo1"/>
+        <w:numPr>
+          <w:ilvl w:val="0"/>
+          <w:numId w:val="29"/>
+        </w:numPr>
+        <w:rPr>
+          <w:rFonts w:asciiTheme="minorHAnsi" w:hAnsiTheme="minorHAnsi"/>
+          <w:sz w:val="24"/>
+          <w:szCs w:val="24"/>
+        </w:rPr>
+      </w:pPr>
+      <w:proofErr w:type="spellStart"/>
+      <w:r>
+        <w:rPr>
+          <w:rFonts w:asciiTheme="minorHAnsi" w:hAnsiTheme="minorHAnsi"/>
+          <w:sz w:val="24"/>
+          <w:szCs w:val="24"/>
+        </w:rPr>
         <w:t>Introducción</w:t>
       </w:r>
       <w:bookmarkEnd w:id="2"/>
@@ -2437,14 +3776,24 @@
       <w:bookmarkEnd w:id="4"/>
       <w:bookmarkEnd w:id="5"/>
       <w:bookmarkEnd w:id="6"/>
+      <w:proofErr w:type="spellEnd"/>
     </w:p>
     <w:p>
       <w:r>
-        <w:t>- El presente sistema ha sido desarrollado para optimizar la gestión operativa de la veterinaria Ciudad Canina, permitiendo una administración eficiente de sus procesos internos y la atención al cliente. A través de este sistema, los clientes pueden agendar citas y consultar el historial de sus mascotas</w:t>
+        <w:t>- El presente sistema ha sido desarrollado para optimizar la gestión operativa de l</w:t>
       </w:r>
-      <w:bookmarkStart w:id="7" w:name="_Hlk198107395"/>
       <w:r>
-        <w:t>, mientras que el personal administrativo tiene acceso a herramientas para la gestión de usuarios, mascotas, programación de citas, control de inventario y generación de reportes internos. El sistema está diseñado para mejorar la organización, reducir errores manuales y brindar un servicio más ágil y eficaz.</w:t>
+        <w:t>a veterinaria Ciudad Canina, permitiendo una administración eficiente de sus procesos internos y la atención al cliente. A través de este sistema, los clientes pueden agendar citas y consultar el historial de sus mascotas</w:t>
+      </w:r>
+      <w:bookmarkStart w:id="8" w:name="_Hlk198107395"/>
+      <w:r>
+        <w:t>, mientras que el personal administ</w:t>
+      </w:r>
+      <w:r>
+        <w:t xml:space="preserve">rativo tiene acceso a herramientas para la gestión de usuarios, mascotas, programación de citas, control de inventario y generación de reportes internos. El sistema está diseñado para mejorar la organización, reducir errores manuales y brindar un servicio </w:t>
+      </w:r>
+      <w:r>
+        <w:t>más ágil y eficaz.</w:t>
       </w:r>
     </w:p>
     <w:p>
@@ -2458,8 +3807,8 @@
           <w:szCs w:val="22"/>
         </w:rPr>
       </w:pPr>
-      <w:bookmarkStart w:id="8" w:name="_Toc198141114"/>
-      <w:bookmarkEnd w:id="7"/>
+      <w:bookmarkStart w:id="9" w:name="_Toc198141114"/>
+      <w:bookmarkEnd w:id="8"/>
       <w:r>
         <w:rPr>
           <w:rFonts w:asciiTheme="minorHAnsi" w:hAnsiTheme="minorHAnsi"/>
@@ -2470,7 +3819,7 @@
         </w:rPr>
         <w:t>- Objetivo del manual:</w:t>
       </w:r>
-      <w:bookmarkEnd w:id="8"/>
+      <w:bookmarkEnd w:id="9"/>
     </w:p>
     <w:p>
       <w:pPr>
@@ -2569,7 +3918,14 @@
           <w:rFonts w:eastAsia="Times New Roman" w:cs="Times New Roman"/>
           <w:lang w:val="es-CO" w:eastAsia="es-CO"/>
         </w:rPr>
-        <w:t>Asegurar que cualquier miembro del equipo técnico pueda:</w:t>
+        <w:t xml:space="preserve">Asegurar </w:t>
+      </w:r>
+      <w:r>
+        <w:rPr>
+          <w:rFonts w:eastAsia="Times New Roman" w:cs="Times New Roman"/>
+          <w:lang w:val="es-CO" w:eastAsia="es-CO"/>
+        </w:rPr>
+        <w:t>que cualquier miembro del equipo técnico pueda:</w:t>
       </w:r>
     </w:p>
     <w:p>
@@ -2673,7 +4029,7 @@
           <w:lang w:val="es-CO" w:eastAsia="es-CO"/>
         </w:rPr>
       </w:pPr>
-      <w:bookmarkStart w:id="9" w:name="_Toc198141115"/>
+      <w:bookmarkStart w:id="10" w:name="_Toc198141115"/>
       <w:r>
         <w:rPr>
           <w:rFonts w:asciiTheme="minorHAnsi" w:hAnsiTheme="minorHAnsi"/>
@@ -2696,7 +4052,7 @@
         </w:rPr>
         <w:t>Público al que va Dirigido</w:t>
       </w:r>
-      <w:bookmarkEnd w:id="9"/>
+      <w:bookmarkEnd w:id="10"/>
     </w:p>
     <w:p>
       <w:pPr>
@@ -2771,7 +4127,14 @@
           <w:rFonts w:eastAsia="Times New Roman" w:cs="Times New Roman"/>
           <w:lang w:val="es-CO" w:eastAsia="es-CO"/>
         </w:rPr>
-        <w:t>Administradores de sistemas: encargados de la configuración de entornos y servidores.</w:t>
+        <w:t>Administradores de sistemas: e</w:t>
+      </w:r>
+      <w:r>
+        <w:rPr>
+          <w:rFonts w:eastAsia="Times New Roman" w:cs="Times New Roman"/>
+          <w:lang w:val="es-CO" w:eastAsia="es-CO"/>
+        </w:rPr>
+        <w:t>ncargados de la configuración de entornos y servidores.</w:t>
       </w:r>
     </w:p>
     <w:p>
@@ -2808,6 +4171,7 @@
           <w:rFonts w:eastAsia="Times New Roman" w:cs="Times New Roman"/>
           <w:lang w:val="es-CO" w:eastAsia="es-CO"/>
         </w:rPr>
+        <w:lastRenderedPageBreak/>
         <w:pict w14:anchorId="469710CF">
           <v:rect id="_x0000_i1025" style="width:0;height:1.5pt" o:hralign="center" o:hrstd="t" o:hr="t" fillcolor="#a0a0a0" stroked="f"/>
         </w:pict>
@@ -3301,7 +4665,6 @@
               <w:rPr>
                 <w:noProof/>
               </w:rPr>
-              <w:lastRenderedPageBreak/>
               <w:drawing>
                 <wp:inline distT="0" distB="0" distL="0" distR="0" wp14:anchorId="0E7BA19F" wp14:editId="37F40AC2">
                   <wp:extent cx="1089025" cy="1089025"/>
@@ -3689,12 +5052,12 @@
           <w:szCs w:val="24"/>
         </w:rPr>
       </w:pPr>
-      <w:bookmarkStart w:id="10" w:name="_Toc197934497"/>
-      <w:bookmarkStart w:id="11" w:name="_Toc26745"/>
-      <w:bookmarkStart w:id="12" w:name="_Toc408"/>
-      <w:bookmarkStart w:id="13" w:name="_Toc11695"/>
-      <w:bookmarkStart w:id="14" w:name="_Toc198105239"/>
-      <w:bookmarkStart w:id="15" w:name="_Toc198141116"/>
+      <w:bookmarkStart w:id="11" w:name="_Toc197934497"/>
+      <w:bookmarkStart w:id="12" w:name="_Toc26745"/>
+      <w:bookmarkStart w:id="13" w:name="_Toc408"/>
+      <w:bookmarkStart w:id="14" w:name="_Toc11695"/>
+      <w:bookmarkStart w:id="15" w:name="_Toc198105239"/>
+      <w:bookmarkStart w:id="16" w:name="_Toc198141116"/>
       <w:r>
         <w:rPr>
           <w:rStyle w:val="fadeinm1hgl8"/>
@@ -3702,14 +5065,23 @@
           <w:sz w:val="24"/>
           <w:szCs w:val="24"/>
         </w:rPr>
-        <w:t>2. Arquitectura del Sistema</w:t>
+        <w:t>2. Arquitectura del</w:t>
       </w:r>
-      <w:bookmarkEnd w:id="10"/>
+      <w:r>
+        <w:rPr>
+          <w:rStyle w:val="fadeinm1hgl8"/>
+          <w:rFonts w:asciiTheme="minorHAnsi" w:hAnsiTheme="minorHAnsi"/>
+          <w:sz w:val="24"/>
+          <w:szCs w:val="24"/>
+        </w:rPr>
+        <w:t xml:space="preserve"> Sistema</w:t>
+      </w:r>
       <w:bookmarkEnd w:id="11"/>
       <w:bookmarkEnd w:id="12"/>
       <w:bookmarkEnd w:id="13"/>
       <w:bookmarkEnd w:id="14"/>
       <w:bookmarkEnd w:id="15"/>
+      <w:bookmarkEnd w:id="16"/>
     </w:p>
     <w:p>
       <w:pPr>
@@ -3890,12 +5262,12 @@
           <w:szCs w:val="24"/>
         </w:rPr>
       </w:pPr>
-      <w:bookmarkStart w:id="16" w:name="_Toc197934498"/>
-      <w:bookmarkStart w:id="17" w:name="_Toc8443"/>
-      <w:bookmarkStart w:id="18" w:name="_Toc31778"/>
-      <w:bookmarkStart w:id="19" w:name="_Toc8057"/>
-      <w:bookmarkStart w:id="20" w:name="_Toc198105240"/>
-      <w:bookmarkStart w:id="21" w:name="_Toc198141117"/>
+      <w:bookmarkStart w:id="17" w:name="_Toc197934498"/>
+      <w:bookmarkStart w:id="18" w:name="_Toc8443"/>
+      <w:bookmarkStart w:id="19" w:name="_Toc31778"/>
+      <w:bookmarkStart w:id="20" w:name="_Toc8057"/>
+      <w:bookmarkStart w:id="21" w:name="_Toc198105240"/>
+      <w:bookmarkStart w:id="22" w:name="_Toc198141117"/>
       <w:r>
         <w:rPr>
           <w:rStyle w:val="fadeinm1hgl8"/>
@@ -3905,12 +5277,12 @@
         </w:rPr>
         <w:t>3. Tecnologías Utilizadas</w:t>
       </w:r>
-      <w:bookmarkEnd w:id="16"/>
       <w:bookmarkEnd w:id="17"/>
       <w:bookmarkEnd w:id="18"/>
       <w:bookmarkEnd w:id="19"/>
       <w:bookmarkEnd w:id="20"/>
       <w:bookmarkEnd w:id="21"/>
+      <w:bookmarkEnd w:id="22"/>
     </w:p>
     <w:p>
       <w:pPr>
@@ -4200,24 +5572,16 @@
           <w:szCs w:val="24"/>
         </w:rPr>
       </w:pPr>
-      <w:bookmarkStart w:id="22" w:name="_Toc198141118"/>
+      <w:bookmarkStart w:id="23" w:name="_Toc198141118"/>
       <w:r>
         <w:rPr>
           <w:rFonts w:asciiTheme="minorHAnsi" w:hAnsiTheme="minorHAnsi"/>
           <w:sz w:val="24"/>
           <w:szCs w:val="24"/>
         </w:rPr>
-        <w:t xml:space="preserve">4. </w:t>
+        <w:t>4. Instalación de Herramientas y Programas</w:t>
       </w:r>
-      <w:r>
-        <w:rPr>
-          <w:rFonts w:asciiTheme="minorHAnsi" w:hAnsiTheme="minorHAnsi"/>
-          <w:sz w:val="24"/>
-          <w:szCs w:val="24"/>
-        </w:rPr>
-        <w:t>Instalación de Herramientas y Programas</w:t>
-      </w:r>
-      <w:bookmarkEnd w:id="22"/>
+      <w:bookmarkEnd w:id="23"/>
     </w:p>
     <w:p>
       <w:pPr>
@@ -4230,8 +5594,8 @@
           <w:szCs w:val="22"/>
         </w:rPr>
       </w:pPr>
-      <w:bookmarkStart w:id="23" w:name="_Toc198135377"/>
-      <w:bookmarkStart w:id="24" w:name="_Toc198141119"/>
+      <w:bookmarkStart w:id="24" w:name="_Toc198135377"/>
+      <w:bookmarkStart w:id="25" w:name="_Toc198141119"/>
       <w:r>
         <w:rPr>
           <w:rFonts w:asciiTheme="minorHAnsi" w:hAnsiTheme="minorHAnsi"/>
@@ -4242,8 +5606,8 @@
         </w:rPr>
         <w:t>Instalación de Node.js y npm</w:t>
       </w:r>
-      <w:bookmarkEnd w:id="23"/>
       <w:bookmarkEnd w:id="24"/>
+      <w:bookmarkEnd w:id="25"/>
     </w:p>
     <w:p>
       <w:pPr>
@@ -4284,6 +5648,7 @@
           <w:szCs w:val="24"/>
           <w:lang w:eastAsia="es-CO"/>
         </w:rPr>
+        <w:lastRenderedPageBreak/>
         <w:t>Pasos:</w:t>
       </w:r>
     </w:p>
@@ -4404,7 +5769,6 @@
           <w:szCs w:val="24"/>
           <w:lang w:eastAsia="es-CO"/>
         </w:rPr>
-        <w:lastRenderedPageBreak/>
         <w:t>Finalizar la instalación.</w:t>
       </w:r>
     </w:p>
@@ -5020,7 +6384,7 @@
           <w:lang w:eastAsia="es-CO"/>
         </w:rPr>
         <w:pict w14:anchorId="0D5C651D">
-          <v:rect id="_x0000_i1033" style="width:0;height:1.5pt" o:hralign="center" o:hrstd="t" o:hr="t" fillcolor="#a0a0a0" stroked="f"/>
+          <v:rect id="_x0000_i1028" style="width:0;height:1.5pt" o:hralign="center" o:hrstd="t" o:hr="t" fillcolor="#a0a0a0" stroked="f"/>
         </w:pict>
       </w:r>
     </w:p>
@@ -5035,8 +6399,8 @@
           <w:szCs w:val="22"/>
         </w:rPr>
       </w:pPr>
-      <w:bookmarkStart w:id="25" w:name="_Toc198135378"/>
-      <w:bookmarkStart w:id="26" w:name="_Toc198141120"/>
+      <w:bookmarkStart w:id="26" w:name="_Toc198135378"/>
+      <w:bookmarkStart w:id="27" w:name="_Toc198141120"/>
       <w:r>
         <w:rPr>
           <w:rFonts w:asciiTheme="minorHAnsi" w:hAnsiTheme="minorHAnsi"/>
@@ -5047,8 +6411,8 @@
         </w:rPr>
         <w:t>Instalación de Git</w:t>
       </w:r>
-      <w:bookmarkEnd w:id="25"/>
       <w:bookmarkEnd w:id="26"/>
+      <w:bookmarkEnd w:id="27"/>
     </w:p>
     <w:p>
       <w:pPr>
@@ -5137,25 +6501,7 @@
           <w:szCs w:val="24"/>
           <w:lang w:eastAsia="es-CO"/>
         </w:rPr>
-        <w:t xml:space="preserve">Descargar el instalador </w:t>
-      </w:r>
-      <w:r>
-        <w:rPr>
-          <w:rFonts w:ascii="Cambria" w:eastAsia="Times New Roman" w:hAnsi="Cambria" w:cs="Times New Roman"/>
-          <w:sz w:val="24"/>
-          <w:szCs w:val="24"/>
-          <w:lang w:eastAsia="es-CO"/>
-        </w:rPr>
-        <w:t>para-Windows o</w:t>
-      </w:r>
-      <w:r>
-        <w:rPr>
-          <w:rFonts w:ascii="Cambria" w:eastAsia="Times New Roman" w:hAnsi="Cambria" w:cs="Times New Roman"/>
-          <w:sz w:val="24"/>
-          <w:szCs w:val="24"/>
-          <w:lang w:eastAsia="es-CO"/>
-        </w:rPr>
-        <w:t xml:space="preserve"> el sistema correspondiente.</w:t>
+        <w:t>Descargar el instalador para-Windows o el sistema correspondiente.</w:t>
       </w:r>
     </w:p>
     <w:p>
@@ -5352,7 +6698,7 @@
           <w:lang w:eastAsia="es-CO"/>
         </w:rPr>
         <w:pict w14:anchorId="2C9FD2D1">
-          <v:rect id="_x0000_i1034" style="width:0;height:1.5pt" o:hralign="center" o:hrstd="t" o:hr="t" fillcolor="#a0a0a0" stroked="f"/>
+          <v:rect id="_x0000_i1029" style="width:0;height:1.5pt" o:hralign="center" o:hrstd="t" o:hr="t" fillcolor="#a0a0a0" stroked="f"/>
         </w:pict>
       </w:r>
     </w:p>
@@ -5367,8 +6713,8 @@
           <w:szCs w:val="22"/>
         </w:rPr>
       </w:pPr>
-      <w:bookmarkStart w:id="27" w:name="_Toc198135379"/>
-      <w:bookmarkStart w:id="28" w:name="_Toc198141121"/>
+      <w:bookmarkStart w:id="28" w:name="_Toc198135379"/>
+      <w:bookmarkStart w:id="29" w:name="_Toc198141121"/>
       <w:r>
         <w:rPr>
           <w:rFonts w:asciiTheme="minorHAnsi" w:hAnsiTheme="minorHAnsi"/>
@@ -5379,8 +6725,8 @@
         </w:rPr>
         <w:t>Instalación de Visual Studio Code</w:t>
       </w:r>
-      <w:bookmarkEnd w:id="27"/>
       <w:bookmarkEnd w:id="28"/>
+      <w:bookmarkEnd w:id="29"/>
     </w:p>
     <w:p>
       <w:pPr>
@@ -5589,6 +6935,7 @@
           <w:szCs w:val="24"/>
           <w:lang w:eastAsia="es-CO"/>
         </w:rPr>
+        <w:lastRenderedPageBreak/>
         <w:t>Thunder Client (opcional para probar API)</w:t>
       </w:r>
     </w:p>
@@ -5610,7 +6957,7 @@
           <w:lang w:eastAsia="es-CO"/>
         </w:rPr>
         <w:pict w14:anchorId="0A676822">
-          <v:rect id="_x0000_i1035" style="width:0;height:1.5pt" o:hralign="center" o:hrstd="t" o:hr="t" fillcolor="#a0a0a0" stroked="f"/>
+          <v:rect id="_x0000_i1030" style="width:0;height:1.5pt" o:hralign="center" o:hrstd="t" o:hr="t" fillcolor="#a0a0a0" stroked="f"/>
         </w:pict>
       </w:r>
     </w:p>
@@ -5691,7 +7038,6 @@
               <w:rPr>
                 <w:noProof/>
               </w:rPr>
-              <w:lastRenderedPageBreak/>
               <w:drawing>
                 <wp:inline distT="0" distB="0" distL="0" distR="0" wp14:anchorId="49DADBFD" wp14:editId="6C364AA8">
                   <wp:extent cx="1089025" cy="1089025"/>
@@ -6091,8 +7437,8 @@
           <w:szCs w:val="22"/>
         </w:rPr>
       </w:pPr>
-      <w:bookmarkStart w:id="29" w:name="_Toc198135380"/>
-      <w:bookmarkStart w:id="30" w:name="_Toc198141122"/>
+      <w:bookmarkStart w:id="30" w:name="_Toc198135380"/>
+      <w:bookmarkStart w:id="31" w:name="_Toc198141122"/>
       <w:r>
         <w:rPr>
           <w:rFonts w:asciiTheme="minorHAnsi" w:hAnsiTheme="minorHAnsi"/>
@@ -6103,8 +7449,8 @@
         </w:rPr>
         <w:t>Instalación de MySQL y MySQL Workbench</w:t>
       </w:r>
-      <w:bookmarkEnd w:id="29"/>
       <w:bookmarkEnd w:id="30"/>
+      <w:bookmarkEnd w:id="31"/>
     </w:p>
     <w:p>
       <w:pPr>
@@ -6475,7 +7821,7 @@
           <w:lang w:eastAsia="es-CO"/>
         </w:rPr>
         <w:pict w14:anchorId="3C12896A">
-          <v:rect id="_x0000_i1036" style="width:0;height:1.5pt" o:hralign="center" o:hrstd="t" o:hr="t" fillcolor="#a0a0a0" stroked="f"/>
+          <v:rect id="_x0000_i1031" style="width:0;height:1.5pt" o:hralign="center" o:hrstd="t" o:hr="t" fillcolor="#a0a0a0" stroked="f"/>
         </w:pict>
       </w:r>
     </w:p>
@@ -6514,8 +7860,8 @@
           <w:szCs w:val="22"/>
         </w:rPr>
       </w:pPr>
-      <w:bookmarkStart w:id="31" w:name="_Toc198135383"/>
-      <w:bookmarkStart w:id="32" w:name="_Toc198141123"/>
+      <w:bookmarkStart w:id="32" w:name="_Toc198135383"/>
+      <w:bookmarkStart w:id="33" w:name="_Toc198141123"/>
       <w:r>
         <w:rPr>
           <w:rFonts w:asciiTheme="minorHAnsi" w:hAnsiTheme="minorHAnsi"/>
@@ -6526,8 +7872,8 @@
         </w:rPr>
         <w:t>Instalación de ngrok</w:t>
       </w:r>
-      <w:bookmarkEnd w:id="31"/>
       <w:bookmarkEnd w:id="32"/>
+      <w:bookmarkEnd w:id="33"/>
     </w:p>
     <w:p>
       <w:pPr>
@@ -6658,6 +8004,7 @@
           <w:rFonts w:ascii="Cambria" w:eastAsia="Times New Roman" w:hAnsi="Cambria" w:cs="Courier New"/>
           <w:lang w:eastAsia="es-CO"/>
         </w:rPr>
+        <w:lastRenderedPageBreak/>
         <w:t>npm install -g ngrok</w:t>
       </w:r>
     </w:p>
@@ -6685,12 +8032,12 @@
           <w:color w:val="1F497D" w:themeColor="text2"/>
         </w:rPr>
       </w:pPr>
-      <w:bookmarkStart w:id="33" w:name="_Toc197934499"/>
-      <w:bookmarkStart w:id="34" w:name="_Toc6178"/>
-      <w:bookmarkStart w:id="35" w:name="_Toc27029"/>
-      <w:bookmarkStart w:id="36" w:name="_Toc11531"/>
-      <w:bookmarkStart w:id="37" w:name="_Toc198105241"/>
-      <w:bookmarkStart w:id="38" w:name="_Toc198141124"/>
+      <w:bookmarkStart w:id="34" w:name="_Toc197934499"/>
+      <w:bookmarkStart w:id="35" w:name="_Toc6178"/>
+      <w:bookmarkStart w:id="36" w:name="_Toc27029"/>
+      <w:bookmarkStart w:id="37" w:name="_Toc11531"/>
+      <w:bookmarkStart w:id="38" w:name="_Toc198105241"/>
+      <w:bookmarkStart w:id="39" w:name="_Toc198141124"/>
       <w:r>
         <w:rPr>
           <w:rStyle w:val="fadeinm1hgl8"/>
@@ -6699,7 +8046,6 @@
           <w:sz w:val="24"/>
           <w:szCs w:val="24"/>
         </w:rPr>
-        <w:lastRenderedPageBreak/>
         <w:t>5</w:t>
       </w:r>
       <w:r>
@@ -6712,12 +8058,12 @@
         </w:rPr>
         <w:t>. Estructura de Archivos</w:t>
       </w:r>
-      <w:bookmarkEnd w:id="33"/>
       <w:bookmarkEnd w:id="34"/>
       <w:bookmarkEnd w:id="35"/>
       <w:bookmarkEnd w:id="36"/>
       <w:bookmarkEnd w:id="37"/>
       <w:bookmarkEnd w:id="38"/>
+      <w:bookmarkEnd w:id="39"/>
     </w:p>
     <w:p>
       <w:pPr>
@@ -6822,7 +8168,7 @@
     <w:p>
       <w:r>
         <w:pict w14:anchorId="5299F501">
-          <v:rect id="_x0000_i1028" style="width:0;height:1.5pt" o:hralign="center" o:hrstd="t" o:hr="t" fillcolor="#a0a0a0" stroked="f"/>
+          <v:rect id="_x0000_i1032" style="width:0;height:1.5pt" o:hralign="center" o:hrstd="t" o:hr="t" fillcolor="#a0a0a0" stroked="f"/>
         </w:pict>
       </w:r>
     </w:p>
@@ -6830,12 +8176,12 @@
       <w:pPr>
         <w:pStyle w:val="Ttulo1"/>
       </w:pPr>
-      <w:bookmarkStart w:id="39" w:name="_Toc197934500"/>
-      <w:bookmarkStart w:id="40" w:name="_Toc3542"/>
-      <w:bookmarkStart w:id="41" w:name="_Toc11639"/>
-      <w:bookmarkStart w:id="42" w:name="_Toc11703"/>
-      <w:bookmarkStart w:id="43" w:name="_Toc198105242"/>
-      <w:bookmarkStart w:id="44" w:name="_Toc198141125"/>
+      <w:bookmarkStart w:id="40" w:name="_Toc197934500"/>
+      <w:bookmarkStart w:id="41" w:name="_Toc3542"/>
+      <w:bookmarkStart w:id="42" w:name="_Toc11639"/>
+      <w:bookmarkStart w:id="43" w:name="_Toc11703"/>
+      <w:bookmarkStart w:id="44" w:name="_Toc198105242"/>
+      <w:bookmarkStart w:id="45" w:name="_Toc198141125"/>
       <w:r>
         <w:rPr>
           <w:rStyle w:val="fadeinm1hgl8"/>
@@ -6856,12 +8202,12 @@
         </w:rPr>
         <w:t>. Base de Datos</w:t>
       </w:r>
-      <w:bookmarkEnd w:id="39"/>
       <w:bookmarkEnd w:id="40"/>
       <w:bookmarkEnd w:id="41"/>
       <w:bookmarkEnd w:id="42"/>
       <w:bookmarkEnd w:id="43"/>
       <w:bookmarkEnd w:id="44"/>
+      <w:bookmarkEnd w:id="45"/>
     </w:p>
     <w:p>
       <w:pPr>
@@ -7398,12 +8744,12 @@
           <w:color w:val="17365D" w:themeColor="text2" w:themeShade="BF"/>
         </w:rPr>
       </w:pPr>
-      <w:bookmarkStart w:id="45" w:name="_Toc197934501"/>
-      <w:bookmarkStart w:id="46" w:name="_Toc9140"/>
-      <w:bookmarkStart w:id="47" w:name="_Toc4820"/>
-      <w:bookmarkStart w:id="48" w:name="_Toc30968"/>
-      <w:bookmarkStart w:id="49" w:name="_Toc198105243"/>
-      <w:bookmarkStart w:id="50" w:name="_Toc198141126"/>
+      <w:bookmarkStart w:id="46" w:name="_Toc197934501"/>
+      <w:bookmarkStart w:id="47" w:name="_Toc9140"/>
+      <w:bookmarkStart w:id="48" w:name="_Toc4820"/>
+      <w:bookmarkStart w:id="49" w:name="_Toc30968"/>
+      <w:bookmarkStart w:id="50" w:name="_Toc198105243"/>
+      <w:bookmarkStart w:id="51" w:name="_Toc198141126"/>
       <w:r>
         <w:rPr>
           <w:rStyle w:val="fadeinm1hgl8"/>
@@ -7424,11 +8770,11 @@
         </w:rPr>
         <w:t>. Configuración del Entorno</w:t>
       </w:r>
-      <w:bookmarkEnd w:id="45"/>
       <w:bookmarkEnd w:id="46"/>
       <w:bookmarkEnd w:id="47"/>
       <w:bookmarkEnd w:id="48"/>
       <w:bookmarkEnd w:id="49"/>
+      <w:bookmarkEnd w:id="50"/>
       <w:r>
         <w:rPr>
           <w:rStyle w:val="fadeinm1hgl8"/>
@@ -7439,7 +8785,7 @@
         </w:rPr>
         <w:t xml:space="preserve"> Backend</w:t>
       </w:r>
-      <w:bookmarkEnd w:id="50"/>
+      <w:bookmarkEnd w:id="51"/>
     </w:p>
     <w:p>
       <w:pPr>
@@ -7699,13 +9045,14 @@
           <w:sz w:val="22"/>
           <w:szCs w:val="22"/>
         </w:rPr>
+        <w:lastRenderedPageBreak/>
         <w:t>npm start</w:t>
       </w:r>
     </w:p>
     <w:p>
       <w:r>
         <w:pict w14:anchorId="2EE2FECB">
-          <v:rect id="_x0000_i1029" style="width:0;height:1.5pt" o:hralign="center" o:hrstd="t" o:hr="t" fillcolor="#a0a0a0" stroked="f"/>
+          <v:rect id="_x0000_i1033" style="width:0;height:1.5pt" o:hralign="center" o:hrstd="t" o:hr="t" fillcolor="#a0a0a0" stroked="f"/>
         </w:pict>
       </w:r>
     </w:p>
@@ -7718,19 +9065,18 @@
           <w:szCs w:val="24"/>
         </w:rPr>
       </w:pPr>
-      <w:bookmarkStart w:id="51" w:name="_Toc197934503"/>
-      <w:bookmarkStart w:id="52" w:name="_Toc9178"/>
-      <w:bookmarkStart w:id="53" w:name="_Toc3748"/>
-      <w:bookmarkStart w:id="54" w:name="_Toc4888"/>
-      <w:bookmarkStart w:id="55" w:name="_Toc198105245"/>
-      <w:bookmarkStart w:id="56" w:name="_Toc198141127"/>
+      <w:bookmarkStart w:id="52" w:name="_Toc197934503"/>
+      <w:bookmarkStart w:id="53" w:name="_Toc9178"/>
+      <w:bookmarkStart w:id="54" w:name="_Toc3748"/>
+      <w:bookmarkStart w:id="55" w:name="_Toc4888"/>
+      <w:bookmarkStart w:id="56" w:name="_Toc198105245"/>
+      <w:bookmarkStart w:id="57" w:name="_Toc198141127"/>
       <w:r>
         <w:rPr>
           <w:rFonts w:asciiTheme="minorHAnsi" w:hAnsiTheme="minorHAnsi"/>
           <w:sz w:val="24"/>
           <w:szCs w:val="24"/>
         </w:rPr>
-        <w:lastRenderedPageBreak/>
         <w:t>8</w:t>
       </w:r>
       <w:r>
@@ -7741,9 +9087,9 @@
         </w:rPr>
         <w:t>. Ngrok – Exposición del</w:t>
       </w:r>
-      <w:bookmarkEnd w:id="51"/>
       <w:bookmarkEnd w:id="52"/>
       <w:bookmarkEnd w:id="53"/>
+      <w:bookmarkEnd w:id="54"/>
       <w:r>
         <w:rPr>
           <w:rFonts w:asciiTheme="minorHAnsi" w:hAnsiTheme="minorHAnsi"/>
@@ -7752,9 +9098,9 @@
         </w:rPr>
         <w:t xml:space="preserve"> front</w:t>
       </w:r>
-      <w:bookmarkEnd w:id="54"/>
       <w:bookmarkEnd w:id="55"/>
       <w:bookmarkEnd w:id="56"/>
+      <w:bookmarkEnd w:id="57"/>
     </w:p>
     <w:p>
       <w:pPr>
@@ -8414,7 +9760,7 @@
     <w:p>
       <w:r>
         <w:pict w14:anchorId="55558225">
-          <v:rect id="_x0000_i1030" style="width:0;height:1.5pt" o:hralign="center" o:hrstd="t" o:hr="t" fillcolor="#a0a0a0" stroked="f"/>
+          <v:rect id="_x0000_i1034" style="width:0;height:1.5pt" o:hralign="center" o:hrstd="t" o:hr="t" fillcolor="#a0a0a0" stroked="f"/>
         </w:pict>
       </w:r>
     </w:p>
@@ -8428,12 +9774,12 @@
           <w:szCs w:val="24"/>
         </w:rPr>
       </w:pPr>
-      <w:bookmarkStart w:id="57" w:name="_Toc197934505"/>
-      <w:bookmarkStart w:id="58" w:name="_Toc10769"/>
-      <w:bookmarkStart w:id="59" w:name="_Toc6829"/>
-      <w:bookmarkStart w:id="60" w:name="_Toc26118"/>
-      <w:bookmarkStart w:id="61" w:name="_Toc198105246"/>
-      <w:bookmarkStart w:id="62" w:name="_Toc198141128"/>
+      <w:bookmarkStart w:id="58" w:name="_Toc197934505"/>
+      <w:bookmarkStart w:id="59" w:name="_Toc10769"/>
+      <w:bookmarkStart w:id="60" w:name="_Toc6829"/>
+      <w:bookmarkStart w:id="61" w:name="_Toc26118"/>
+      <w:bookmarkStart w:id="62" w:name="_Toc198105246"/>
+      <w:bookmarkStart w:id="63" w:name="_Toc198141128"/>
       <w:r>
         <w:rPr>
           <w:rFonts w:asciiTheme="minorHAnsi" w:hAnsiTheme="minorHAnsi"/>
@@ -8441,23 +9787,14 @@
           <w:sz w:val="24"/>
           <w:szCs w:val="24"/>
         </w:rPr>
-        <w:t>9</w:t>
+        <w:t>9. Acceso desde Navegador</w:t>
       </w:r>
-      <w:r>
-        <w:rPr>
-          <w:rFonts w:asciiTheme="minorHAnsi" w:hAnsiTheme="minorHAnsi"/>
-          <w:color w:val="1F497D" w:themeColor="text2"/>
-          <w:sz w:val="24"/>
-          <w:szCs w:val="24"/>
-        </w:rPr>
-        <w:t>. Acceso desde Navegador</w:t>
-      </w:r>
-      <w:bookmarkEnd w:id="57"/>
       <w:bookmarkEnd w:id="58"/>
       <w:bookmarkEnd w:id="59"/>
       <w:bookmarkEnd w:id="60"/>
       <w:bookmarkEnd w:id="61"/>
       <w:bookmarkEnd w:id="62"/>
+      <w:bookmarkEnd w:id="63"/>
     </w:p>
     <w:p>
       <w:pPr>
@@ -8475,7 +9812,16 @@
           <w:sz w:val="22"/>
           <w:szCs w:val="22"/>
         </w:rPr>
-        <w:t>Una vez ambos servidores (frontend y backend) estén en ejecución, accede a la aplicación desde el navegador con la URL proporcionada por Ngrok, por ejemplo:</w:t>
+        <w:t xml:space="preserve">Una vez ambos servidores (frontend y backend) estén en ejecución, accede a la aplicación desde el navegador con la URL proporcionada por Ngrok, </w:t>
+      </w:r>
+      <w:r>
+        <w:rPr>
+          <w:rStyle w:val="fadeinm1hgl8"/>
+          <w:rFonts w:asciiTheme="minorHAnsi" w:hAnsiTheme="minorHAnsi"/>
+          <w:sz w:val="22"/>
+          <w:szCs w:val="22"/>
+        </w:rPr>
+        <w:t>por ejemplo:</w:t>
       </w:r>
     </w:p>
     <w:p>
@@ -8510,7 +9856,7 @@
     <w:p>
       <w:r>
         <w:pict w14:anchorId="4C6E9B75">
-          <v:rect id="_x0000_i1031" style="width:0;height:1.5pt" o:hralign="center" o:hrstd="t" o:hr="t" fillcolor="#a0a0a0" stroked="f"/>
+          <v:rect id="_x0000_i1035" style="width:0;height:1.5pt" o:hralign="center" o:hrstd="t" o:hr="t" fillcolor="#a0a0a0" stroked="f"/>
         </w:pict>
       </w:r>
     </w:p>
@@ -8524,12 +9870,12 @@
           <w:szCs w:val="24"/>
         </w:rPr>
       </w:pPr>
-      <w:bookmarkStart w:id="63" w:name="_Toc197934506"/>
-      <w:bookmarkStart w:id="64" w:name="_Toc24481"/>
-      <w:bookmarkStart w:id="65" w:name="_Toc11921"/>
-      <w:bookmarkStart w:id="66" w:name="_Toc2687"/>
-      <w:bookmarkStart w:id="67" w:name="_Toc198105247"/>
-      <w:bookmarkStart w:id="68" w:name="_Toc198141129"/>
+      <w:bookmarkStart w:id="64" w:name="_Toc197934506"/>
+      <w:bookmarkStart w:id="65" w:name="_Toc24481"/>
+      <w:bookmarkStart w:id="66" w:name="_Toc11921"/>
+      <w:bookmarkStart w:id="67" w:name="_Toc2687"/>
+      <w:bookmarkStart w:id="68" w:name="_Toc198105247"/>
+      <w:bookmarkStart w:id="69" w:name="_Toc198141129"/>
       <w:r>
         <w:rPr>
           <w:rStyle w:val="fadeinm1hgl8"/>
@@ -8538,8 +9884,9 @@
           <w:sz w:val="24"/>
           <w:szCs w:val="24"/>
         </w:rPr>
-        <w:t>10</w:t>
+        <w:t xml:space="preserve">10. Usuario </w:t>
       </w:r>
+      <w:bookmarkEnd w:id="64"/>
       <w:r>
         <w:rPr>
           <w:rStyle w:val="fadeinm1hgl8"/>
@@ -8548,24 +9895,13 @@
           <w:sz w:val="24"/>
           <w:szCs w:val="24"/>
         </w:rPr>
-        <w:t xml:space="preserve">. Usuario </w:t>
-      </w:r>
-      <w:bookmarkEnd w:id="63"/>
-      <w:r>
-        <w:rPr>
-          <w:rStyle w:val="fadeinm1hgl8"/>
-          <w:rFonts w:asciiTheme="minorHAnsi" w:hAnsiTheme="minorHAnsi"/>
-          <w:color w:val="1F497D" w:themeColor="text2"/>
-          <w:sz w:val="24"/>
-          <w:szCs w:val="24"/>
-        </w:rPr>
         <w:t>Para-Administrador</w:t>
       </w:r>
-      <w:bookmarkEnd w:id="64"/>
       <w:bookmarkEnd w:id="65"/>
       <w:bookmarkEnd w:id="66"/>
       <w:bookmarkEnd w:id="67"/>
       <w:bookmarkEnd w:id="68"/>
+      <w:bookmarkEnd w:id="69"/>
     </w:p>
     <w:p>
       <w:pPr>
@@ -8657,7 +9993,7 @@
     <w:p>
       <w:r>
         <w:pict w14:anchorId="4A4EC56C">
-          <v:rect id="_x0000_i1032" style="width:0;height:1.5pt" o:hralign="center" o:bullet="t" o:hrstd="t" o:hr="t" fillcolor="#a0a0a0" stroked="f"/>
+          <v:rect id="_x0000_i1036" style="width:0;height:1.5pt" o:hralign="center" o:bullet="t" o:hrstd="t" o:hr="t" fillcolor="#a0a0a0" stroked="f"/>
         </w:pict>
       </w:r>
     </w:p>
@@ -8706,7 +10042,6 @@
               <w:rPr>
                 <w:noProof/>
               </w:rPr>
-              <w:lastRenderedPageBreak/>
               <w:drawing>
                 <wp:inline distT="0" distB="0" distL="0" distR="0" wp14:anchorId="29D5A59B" wp14:editId="043EF5A4">
                   <wp:extent cx="1089025" cy="1089025"/>
@@ -9095,12 +10430,12 @@
           <w:szCs w:val="24"/>
         </w:rPr>
       </w:pPr>
-      <w:bookmarkStart w:id="69" w:name="_Toc197934507"/>
-      <w:bookmarkStart w:id="70" w:name="_Toc4550"/>
-      <w:bookmarkStart w:id="71" w:name="_Toc26520"/>
-      <w:bookmarkStart w:id="72" w:name="_Toc439"/>
-      <w:bookmarkStart w:id="73" w:name="_Toc198105248"/>
-      <w:bookmarkStart w:id="74" w:name="_Toc198141130"/>
+      <w:bookmarkStart w:id="70" w:name="_Toc197934507"/>
+      <w:bookmarkStart w:id="71" w:name="_Toc4550"/>
+      <w:bookmarkStart w:id="72" w:name="_Toc26520"/>
+      <w:bookmarkStart w:id="73" w:name="_Toc439"/>
+      <w:bookmarkStart w:id="74" w:name="_Toc198105248"/>
+      <w:bookmarkStart w:id="75" w:name="_Toc198141130"/>
       <w:r>
         <w:rPr>
           <w:rFonts w:asciiTheme="minorHAnsi" w:hAnsiTheme="minorHAnsi"/>
@@ -9128,12 +10463,12 @@
         </w:rPr>
         <w:t>. Notas Importantes</w:t>
       </w:r>
-      <w:bookmarkEnd w:id="69"/>
       <w:bookmarkEnd w:id="70"/>
       <w:bookmarkEnd w:id="71"/>
       <w:bookmarkEnd w:id="72"/>
       <w:bookmarkEnd w:id="73"/>
       <w:bookmarkEnd w:id="74"/>
+      <w:bookmarkEnd w:id="75"/>
     </w:p>
     <w:p/>
     <w:p>
@@ -9179,7 +10514,16 @@
           <w:sz w:val="22"/>
           <w:szCs w:val="22"/>
         </w:rPr>
-        <w:t>Asegúrate de que tanto el backend como el frontend estén ejecutándose al mismo tiempo.</w:t>
+        <w:t xml:space="preserve">Asegúrate de que tanto el backend como el frontend </w:t>
+      </w:r>
+      <w:r>
+        <w:rPr>
+          <w:rStyle w:val="fadeinm1hgl8"/>
+          <w:rFonts w:asciiTheme="minorHAnsi" w:hAnsiTheme="minorHAnsi"/>
+          <w:sz w:val="22"/>
+          <w:szCs w:val="22"/>
+        </w:rPr>
+        <w:t>estén ejecutándose al mismo tiempo.</w:t>
       </w:r>
     </w:p>
     <w:p>
@@ -9271,7 +10615,7 @@
 </file>
 
 <file path=word/endnotes.xml><?xml version="1.0" encoding="utf-8"?>
-<w:endnotes xmlns:wpc="http://schemas.microsoft.com/office/word/2010/wordprocessingCanvas" xmlns:cx="http://schemas.microsoft.com/office/drawing/2014/chartex" xmlns:cx1="http://schemas.microsoft.com/office/drawing/2015/9/8/chartex" xmlns:cx2="http://schemas.microsoft.com/office/drawing/2015/10/21/chartex" xmlns:cx3="http://schemas.microsoft.com/office/drawing/2016/5/9/chartex" xmlns:cx4="http://schemas.microsoft.com/office/drawing/2016/5/10/chartex" xmlns:cx5="http://schemas.microsoft.com/office/drawing/2016/5/11/chartex" xmlns:cx6="http://schemas.microsoft.com/office/drawing/2016/5/12/chartex" xmlns:cx7="http://schemas.microsoft.com/office/drawing/2016/5/13/chartex" xmlns:cx8="http://schemas.microsoft.com/office/drawing/2016/5/14/chartex" xmlns:mc="http://schemas.openxmlformats.org/markup-compatibility/2006" xmlns:aink="http://schemas.microsoft.com/office/drawing/2016/ink" xmlns:am3d="http://schemas.microsoft.com/office/drawing/2017/model3d" xmlns:o="urn:schemas-microsoft-com:office:office" xmlns:oel="http://schemas.microsoft.com/office/2019/extlst" xmlns:r="http://schemas.openxmlformats.org/officeDocument/2006/relationships" xmlns:m="http://schemas.openxmlformats.org/officeDocument/2006/math" xmlns:v="urn:schemas-microsoft-com:vml" xmlns:wp14="http://schemas.microsoft.com/office/word/2010/wordprocessingDrawing" xmlns:wp="http://schemas.openxmlformats.org/drawingml/2006/wordprocessingDrawing" xmlns:w10="urn:schemas-microsoft-com:office:word" xmlns:w="http://schemas.openxmlformats.org/wordprocessingml/2006/main" xmlns:w14="http://schemas.microsoft.com/office/word/2010/wordml" xmlns:w15="http://schemas.microsoft.com/office/word/2012/wordml" xmlns:w16cex="http://schemas.microsoft.com/office/word/2018/wordml/cex" xmlns:w16cid="http://schemas.microsoft.com/office/word/2016/wordml/cid" xmlns:w16="http://schemas.microsoft.com/office/word/2018/wordml" xmlns:w16du="http://schemas.microsoft.com/office/word/2023/wordml/word16du" xmlns:w16sdtdh="http://schemas.microsoft.com/office/word/2020/wordml/sdtdatahash" xmlns:w16sdtfl="http://schemas.microsoft.com/office/word/2024/wordml/sdtformatlock" xmlns:w16se="http://schemas.microsoft.com/office/word/2015/wordml/symex" xmlns:wpg="http://schemas.microsoft.com/office/word/2010/wordprocessingGroup" xmlns:wpi="http://schemas.microsoft.com/office/word/2010/wordprocessingInk" xmlns:wne="http://schemas.microsoft.com/office/word/2006/wordml" xmlns:wps="http://schemas.microsoft.com/office/word/2010/wordprocessingShape" mc:Ignorable="w14 w15 w16se w16cid w16 w16cex w16sdtdh w16sdtfl w16du wp14">
+<w:endnotes xmlns:wpc="http://schemas.microsoft.com/office/word/2010/wordprocessingCanvas" xmlns:cx="http://schemas.microsoft.com/office/drawing/2014/chartex" xmlns:cx1="http://schemas.microsoft.com/office/drawing/2015/9/8/chartex" xmlns:cx2="http://schemas.microsoft.com/office/drawing/2015/10/21/chartex" xmlns:cx3="http://schemas.microsoft.com/office/drawing/2016/5/9/chartex" xmlns:cx4="http://schemas.microsoft.com/office/drawing/2016/5/10/chartex" xmlns:cx5="http://schemas.microsoft.com/office/drawing/2016/5/11/chartex" xmlns:cx6="http://schemas.microsoft.com/office/drawing/2016/5/12/chartex" xmlns:cx7="http://schemas.microsoft.com/office/drawing/2016/5/13/chartex" xmlns:cx8="http://schemas.microsoft.com/office/drawing/2016/5/14/chartex" xmlns:mc="http://schemas.openxmlformats.org/markup-compatibility/2006" xmlns:aink="http://schemas.microsoft.com/office/drawing/2016/ink" xmlns:am3d="http://schemas.microsoft.com/office/drawing/2017/model3d" xmlns:o="urn:schemas-microsoft-com:office:office" xmlns:r="http://schemas.openxmlformats.org/officeDocument/2006/relationships" xmlns:m="http://schemas.openxmlformats.org/officeDocument/2006/math" xmlns:v="urn:schemas-microsoft-com:vml" xmlns:wp14="http://schemas.microsoft.com/office/word/2010/wordprocessingDrawing" xmlns:wp="http://schemas.openxmlformats.org/drawingml/2006/wordprocessingDrawing" xmlns:w10="urn:schemas-microsoft-com:office:word" xmlns:w="http://schemas.openxmlformats.org/wordprocessingml/2006/main" xmlns:w14="http://schemas.microsoft.com/office/word/2010/wordml" xmlns:w15="http://schemas.microsoft.com/office/word/2012/wordml" xmlns:w16cid="http://schemas.microsoft.com/office/word/2016/wordml/cid" xmlns:w16se="http://schemas.microsoft.com/office/word/2015/wordml/symex" xmlns:wpg="http://schemas.microsoft.com/office/word/2010/wordprocessingGroup" xmlns:wpi="http://schemas.microsoft.com/office/word/2010/wordprocessingInk" xmlns:wne="http://schemas.microsoft.com/office/word/2006/wordml" xmlns:wps="http://schemas.microsoft.com/office/word/2010/wordprocessingShape" mc:Ignorable="w14 w15 w16se w16cid wp14">
   <w:endnote w:type="separator" w:id="-1">
     <w:p>
       <w:pPr>
@@ -9296,7 +10640,7 @@
 </file>
 
 <file path=word/footnotes.xml><?xml version="1.0" encoding="utf-8"?>
-<w:footnotes xmlns:wpc="http://schemas.microsoft.com/office/word/2010/wordprocessingCanvas" xmlns:cx="http://schemas.microsoft.com/office/drawing/2014/chartex" xmlns:cx1="http://schemas.microsoft.com/office/drawing/2015/9/8/chartex" xmlns:cx2="http://schemas.microsoft.com/office/drawing/2015/10/21/chartex" xmlns:cx3="http://schemas.microsoft.com/office/drawing/2016/5/9/chartex" xmlns:cx4="http://schemas.microsoft.com/office/drawing/2016/5/10/chartex" xmlns:cx5="http://schemas.microsoft.com/office/drawing/2016/5/11/chartex" xmlns:cx6="http://schemas.microsoft.com/office/drawing/2016/5/12/chartex" xmlns:cx7="http://schemas.microsoft.com/office/drawing/2016/5/13/chartex" xmlns:cx8="http://schemas.microsoft.com/office/drawing/2016/5/14/chartex" xmlns:mc="http://schemas.openxmlformats.org/markup-compatibility/2006" xmlns:aink="http://schemas.microsoft.com/office/drawing/2016/ink" xmlns:am3d="http://schemas.microsoft.com/office/drawing/2017/model3d" xmlns:o="urn:schemas-microsoft-com:office:office" xmlns:oel="http://schemas.microsoft.com/office/2019/extlst" xmlns:r="http://schemas.openxmlformats.org/officeDocument/2006/relationships" xmlns:m="http://schemas.openxmlformats.org/officeDocument/2006/math" xmlns:v="urn:schemas-microsoft-com:vml" xmlns:wp14="http://schemas.microsoft.com/office/word/2010/wordprocessingDrawing" xmlns:wp="http://schemas.openxmlformats.org/drawingml/2006/wordprocessingDrawing" xmlns:w10="urn:schemas-microsoft-com:office:word" xmlns:w="http://schemas.openxmlformats.org/wordprocessingml/2006/main" xmlns:w14="http://schemas.microsoft.com/office/word/2010/wordml" xmlns:w15="http://schemas.microsoft.com/office/word/2012/wordml" xmlns:w16cex="http://schemas.microsoft.com/office/word/2018/wordml/cex" xmlns:w16cid="http://schemas.microsoft.com/office/word/2016/wordml/cid" xmlns:w16="http://schemas.microsoft.com/office/word/2018/wordml" xmlns:w16du="http://schemas.microsoft.com/office/word/2023/wordml/word16du" xmlns:w16sdtdh="http://schemas.microsoft.com/office/word/2020/wordml/sdtdatahash" xmlns:w16sdtfl="http://schemas.microsoft.com/office/word/2024/wordml/sdtformatlock" xmlns:w16se="http://schemas.microsoft.com/office/word/2015/wordml/symex" xmlns:wpg="http://schemas.microsoft.com/office/word/2010/wordprocessingGroup" xmlns:wpi="http://schemas.microsoft.com/office/word/2010/wordprocessingInk" xmlns:wne="http://schemas.microsoft.com/office/word/2006/wordml" xmlns:wps="http://schemas.microsoft.com/office/word/2010/wordprocessingShape" mc:Ignorable="w14 w15 w16se w16cid w16 w16cex w16sdtdh w16sdtfl w16du wp14">
+<w:footnotes xmlns:wpc="http://schemas.microsoft.com/office/word/2010/wordprocessingCanvas" xmlns:cx="http://schemas.microsoft.com/office/drawing/2014/chartex" xmlns:cx1="http://schemas.microsoft.com/office/drawing/2015/9/8/chartex" xmlns:cx2="http://schemas.microsoft.com/office/drawing/2015/10/21/chartex" xmlns:cx3="http://schemas.microsoft.com/office/drawing/2016/5/9/chartex" xmlns:cx4="http://schemas.microsoft.com/office/drawing/2016/5/10/chartex" xmlns:cx5="http://schemas.microsoft.com/office/drawing/2016/5/11/chartex" xmlns:cx6="http://schemas.microsoft.com/office/drawing/2016/5/12/chartex" xmlns:cx7="http://schemas.microsoft.com/office/drawing/2016/5/13/chartex" xmlns:cx8="http://schemas.microsoft.com/office/drawing/2016/5/14/chartex" xmlns:mc="http://schemas.openxmlformats.org/markup-compatibility/2006" xmlns:aink="http://schemas.microsoft.com/office/drawing/2016/ink" xmlns:am3d="http://schemas.microsoft.com/office/drawing/2017/model3d" xmlns:o="urn:schemas-microsoft-com:office:office" xmlns:r="http://schemas.openxmlformats.org/officeDocument/2006/relationships" xmlns:m="http://schemas.openxmlformats.org/officeDocument/2006/math" xmlns:v="urn:schemas-microsoft-com:vml" xmlns:wp14="http://schemas.microsoft.com/office/word/2010/wordprocessingDrawing" xmlns:wp="http://schemas.openxmlformats.org/drawingml/2006/wordprocessingDrawing" xmlns:w10="urn:schemas-microsoft-com:office:word" xmlns:w="http://schemas.openxmlformats.org/wordprocessingml/2006/main" xmlns:w14="http://schemas.microsoft.com/office/word/2010/wordml" xmlns:w15="http://schemas.microsoft.com/office/word/2012/wordml" xmlns:w16cid="http://schemas.microsoft.com/office/word/2016/wordml/cid" xmlns:w16se="http://schemas.microsoft.com/office/word/2015/wordml/symex" xmlns:wpg="http://schemas.microsoft.com/office/word/2010/wordprocessingGroup" xmlns:wpi="http://schemas.microsoft.com/office/word/2010/wordprocessingInk" xmlns:wne="http://schemas.microsoft.com/office/word/2006/wordml" xmlns:wps="http://schemas.microsoft.com/office/word/2010/wordprocessingShape" mc:Ignorable="w14 w15 w16se w16cid wp14">
   <w:footnote w:type="separator" w:id="-1">
     <w:p>
       <w:pPr>
@@ -9321,7 +10665,7 @@
 </file>
 
 <file path=word/header1.xml><?xml version="1.0" encoding="utf-8"?>
-<w:hdr xmlns:wpc="http://schemas.microsoft.com/office/word/2010/wordprocessingCanvas" xmlns:cx="http://schemas.microsoft.com/office/drawing/2014/chartex" xmlns:cx1="http://schemas.microsoft.com/office/drawing/2015/9/8/chartex" xmlns:cx2="http://schemas.microsoft.com/office/drawing/2015/10/21/chartex" xmlns:cx3="http://schemas.microsoft.com/office/drawing/2016/5/9/chartex" xmlns:cx4="http://schemas.microsoft.com/office/drawing/2016/5/10/chartex" xmlns:cx5="http://schemas.microsoft.com/office/drawing/2016/5/11/chartex" xmlns:cx6="http://schemas.microsoft.com/office/drawing/2016/5/12/chartex" xmlns:cx7="http://schemas.microsoft.com/office/drawing/2016/5/13/chartex" xmlns:cx8="http://schemas.microsoft.com/office/drawing/2016/5/14/chartex" xmlns:mc="http://schemas.openxmlformats.org/markup-compatibility/2006" xmlns:aink="http://schemas.microsoft.com/office/drawing/2016/ink" xmlns:am3d="http://schemas.microsoft.com/office/drawing/2017/model3d" xmlns:o="urn:schemas-microsoft-com:office:office" xmlns:oel="http://schemas.microsoft.com/office/2019/extlst" xmlns:r="http://schemas.openxmlformats.org/officeDocument/2006/relationships" xmlns:m="http://schemas.openxmlformats.org/officeDocument/2006/math" xmlns:v="urn:schemas-microsoft-com:vml" xmlns:wp14="http://schemas.microsoft.com/office/word/2010/wordprocessingDrawing" xmlns:wp="http://schemas.openxmlformats.org/drawingml/2006/wordprocessingDrawing" xmlns:w10="urn:schemas-microsoft-com:office:word" xmlns:w="http://schemas.openxmlformats.org/wordprocessingml/2006/main" xmlns:w14="http://schemas.microsoft.com/office/word/2010/wordml" xmlns:w15="http://schemas.microsoft.com/office/word/2012/wordml" xmlns:w16cex="http://schemas.microsoft.com/office/word/2018/wordml/cex" xmlns:w16cid="http://schemas.microsoft.com/office/word/2016/wordml/cid" xmlns:w16="http://schemas.microsoft.com/office/word/2018/wordml" xmlns:w16du="http://schemas.microsoft.com/office/word/2023/wordml/word16du" xmlns:w16sdtdh="http://schemas.microsoft.com/office/word/2020/wordml/sdtdatahash" xmlns:w16sdtfl="http://schemas.microsoft.com/office/word/2024/wordml/sdtformatlock" xmlns:w16se="http://schemas.microsoft.com/office/word/2015/wordml/symex" xmlns:wpg="http://schemas.microsoft.com/office/word/2010/wordprocessingGroup" xmlns:wpi="http://schemas.microsoft.com/office/word/2010/wordprocessingInk" xmlns:wne="http://schemas.microsoft.com/office/word/2006/wordml" xmlns:wps="http://schemas.microsoft.com/office/word/2010/wordprocessingShape" mc:Ignorable="w14 w15 w16se w16cid w16 w16cex w16sdtdh w16sdtfl w16du wp14">
+<w:hdr xmlns:wpc="http://schemas.microsoft.com/office/word/2010/wordprocessingCanvas" xmlns:cx="http://schemas.microsoft.com/office/drawing/2014/chartex" xmlns:cx1="http://schemas.microsoft.com/office/drawing/2015/9/8/chartex" xmlns:cx2="http://schemas.microsoft.com/office/drawing/2015/10/21/chartex" xmlns:cx3="http://schemas.microsoft.com/office/drawing/2016/5/9/chartex" xmlns:cx4="http://schemas.microsoft.com/office/drawing/2016/5/10/chartex" xmlns:cx5="http://schemas.microsoft.com/office/drawing/2016/5/11/chartex" xmlns:cx6="http://schemas.microsoft.com/office/drawing/2016/5/12/chartex" xmlns:cx7="http://schemas.microsoft.com/office/drawing/2016/5/13/chartex" xmlns:cx8="http://schemas.microsoft.com/office/drawing/2016/5/14/chartex" xmlns:mc="http://schemas.openxmlformats.org/markup-compatibility/2006" xmlns:aink="http://schemas.microsoft.com/office/drawing/2016/ink" xmlns:am3d="http://schemas.microsoft.com/office/drawing/2017/model3d" xmlns:o="urn:schemas-microsoft-com:office:office" xmlns:r="http://schemas.openxmlformats.org/officeDocument/2006/relationships" xmlns:m="http://schemas.openxmlformats.org/officeDocument/2006/math" xmlns:v="urn:schemas-microsoft-com:vml" xmlns:wp14="http://schemas.microsoft.com/office/word/2010/wordprocessingDrawing" xmlns:wp="http://schemas.openxmlformats.org/drawingml/2006/wordprocessingDrawing" xmlns:w10="urn:schemas-microsoft-com:office:word" xmlns:w="http://schemas.openxmlformats.org/wordprocessingml/2006/main" xmlns:w14="http://schemas.microsoft.com/office/word/2010/wordml" xmlns:w15="http://schemas.microsoft.com/office/word/2012/wordml" xmlns:w16cid="http://schemas.microsoft.com/office/word/2016/wordml/cid" xmlns:w16se="http://schemas.microsoft.com/office/word/2015/wordml/symex" xmlns:wpg="http://schemas.microsoft.com/office/word/2010/wordprocessingGroup" xmlns:wpi="http://schemas.microsoft.com/office/word/2010/wordprocessingInk" xmlns:wne="http://schemas.microsoft.com/office/word/2006/wordml" xmlns:wps="http://schemas.microsoft.com/office/word/2010/wordprocessingShape" mc:Ignorable="w14 w15 w16se w16cid wp14">
   <w:p>
     <w:pPr>
       <w:pStyle w:val="Encabezado"/>
@@ -9331,7 +10675,7 @@
 </file>
 
 <file path=word/numbering.xml><?xml version="1.0" encoding="utf-8"?>
-<w:numbering xmlns:wpc="http://schemas.microsoft.com/office/word/2010/wordprocessingCanvas" xmlns:cx="http://schemas.microsoft.com/office/drawing/2014/chartex" xmlns:cx1="http://schemas.microsoft.com/office/drawing/2015/9/8/chartex" xmlns:cx2="http://schemas.microsoft.com/office/drawing/2015/10/21/chartex" xmlns:cx3="http://schemas.microsoft.com/office/drawing/2016/5/9/chartex" xmlns:cx4="http://schemas.microsoft.com/office/drawing/2016/5/10/chartex" xmlns:cx5="http://schemas.microsoft.com/office/drawing/2016/5/11/chartex" xmlns:cx6="http://schemas.microsoft.com/office/drawing/2016/5/12/chartex" xmlns:cx7="http://schemas.microsoft.com/office/drawing/2016/5/13/chartex" xmlns:cx8="http://schemas.microsoft.com/office/drawing/2016/5/14/chartex" xmlns:mc="http://schemas.openxmlformats.org/markup-compatibility/2006" xmlns:aink="http://schemas.microsoft.com/office/drawing/2016/ink" xmlns:am3d="http://schemas.microsoft.com/office/drawing/2017/model3d" xmlns:o="urn:schemas-microsoft-com:office:office" xmlns:oel="http://schemas.microsoft.com/office/2019/extlst" xmlns:r="http://schemas.openxmlformats.org/officeDocument/2006/relationships" xmlns:m="http://schemas.openxmlformats.org/officeDocument/2006/math" xmlns:v="urn:schemas-microsoft-com:vml" xmlns:wp14="http://schemas.microsoft.com/office/word/2010/wordprocessingDrawing" xmlns:wp="http://schemas.openxmlformats.org/drawingml/2006/wordprocessingDrawing" xmlns:w10="urn:schemas-microsoft-com:office:word" xmlns:w="http://schemas.openxmlformats.org/wordprocessingml/2006/main" xmlns:w14="http://schemas.microsoft.com/office/word/2010/wordml" xmlns:w15="http://schemas.microsoft.com/office/word/2012/wordml" xmlns:w16cex="http://schemas.microsoft.com/office/word/2018/wordml/cex" xmlns:w16cid="http://schemas.microsoft.com/office/word/2016/wordml/cid" xmlns:w16="http://schemas.microsoft.com/office/word/2018/wordml" xmlns:w16du="http://schemas.microsoft.com/office/word/2023/wordml/word16du" xmlns:w16sdtdh="http://schemas.microsoft.com/office/word/2020/wordml/sdtdatahash" xmlns:w16sdtfl="http://schemas.microsoft.com/office/word/2024/wordml/sdtformatlock" xmlns:w16se="http://schemas.microsoft.com/office/word/2015/wordml/symex" xmlns:wpg="http://schemas.microsoft.com/office/word/2010/wordprocessingGroup" xmlns:wpi="http://schemas.microsoft.com/office/word/2010/wordprocessingInk" xmlns:wne="http://schemas.microsoft.com/office/word/2006/wordml" xmlns:wps="http://schemas.microsoft.com/office/word/2010/wordprocessingShape" mc:Ignorable="w14 w15 w16se w16cid w16 w16cex w16sdtdh w16sdtfl w16du wp14">
+<w:numbering xmlns:wpc="http://schemas.microsoft.com/office/word/2010/wordprocessingCanvas" xmlns:cx="http://schemas.microsoft.com/office/drawing/2014/chartex" xmlns:cx1="http://schemas.microsoft.com/office/drawing/2015/9/8/chartex" xmlns:cx2="http://schemas.microsoft.com/office/drawing/2015/10/21/chartex" xmlns:cx3="http://schemas.microsoft.com/office/drawing/2016/5/9/chartex" xmlns:cx4="http://schemas.microsoft.com/office/drawing/2016/5/10/chartex" xmlns:cx5="http://schemas.microsoft.com/office/drawing/2016/5/11/chartex" xmlns:cx6="http://schemas.microsoft.com/office/drawing/2016/5/12/chartex" xmlns:cx7="http://schemas.microsoft.com/office/drawing/2016/5/13/chartex" xmlns:cx8="http://schemas.microsoft.com/office/drawing/2016/5/14/chartex" xmlns:mc="http://schemas.openxmlformats.org/markup-compatibility/2006" xmlns:aink="http://schemas.microsoft.com/office/drawing/2016/ink" xmlns:am3d="http://schemas.microsoft.com/office/drawing/2017/model3d" xmlns:o="urn:schemas-microsoft-com:office:office" xmlns:r="http://schemas.openxmlformats.org/officeDocument/2006/relationships" xmlns:m="http://schemas.openxmlformats.org/officeDocument/2006/math" xmlns:v="urn:schemas-microsoft-com:vml" xmlns:wp14="http://schemas.microsoft.com/office/word/2010/wordprocessingDrawing" xmlns:wp="http://schemas.openxmlformats.org/drawingml/2006/wordprocessingDrawing" xmlns:w10="urn:schemas-microsoft-com:office:word" xmlns:w="http://schemas.openxmlformats.org/wordprocessingml/2006/main" xmlns:w14="http://schemas.microsoft.com/office/word/2010/wordml" xmlns:w15="http://schemas.microsoft.com/office/word/2012/wordml" xmlns:w16cid="http://schemas.microsoft.com/office/word/2016/wordml/cid" xmlns:w16se="http://schemas.microsoft.com/office/word/2015/wordml/symex" xmlns:wpg="http://schemas.microsoft.com/office/word/2010/wordprocessingGroup" xmlns:wpi="http://schemas.microsoft.com/office/word/2010/wordprocessingInk" xmlns:wne="http://schemas.microsoft.com/office/word/2006/wordml" xmlns:wps="http://schemas.microsoft.com/office/word/2010/wordprocessingShape" mc:Ignorable="w14 w15 w16se w16cid wp14">
   <w:abstractNum w:abstractNumId="0" w15:restartNumberingAfterBreak="0">
     <w:nsid w:val="FFFFFF7E"/>
     <w:multiLevelType w:val="singleLevel"/>
@@ -11038,6 +12382,95 @@
     </w:lvl>
   </w:abstractNum>
   <w:abstractNum w:abstractNumId="20" w15:restartNumberingAfterBreak="0">
+    <w:nsid w:val="2DA55B36"/>
+    <w:multiLevelType w:val="hybridMultilevel"/>
+    <w:tmpl w:val="398AC992"/>
+    <w:lvl w:ilvl="0" w:tplc="240A000F">
+      <w:start w:val="1"/>
+      <w:numFmt w:val="decimal"/>
+      <w:lvlText w:val="%1."/>
+      <w:lvlJc w:val="left"/>
+      <w:pPr>
+        <w:ind w:left="720" w:hanging="360"/>
+      </w:pPr>
+      <w:rPr>
+        <w:rFonts w:hint="default"/>
+      </w:rPr>
+    </w:lvl>
+    <w:lvl w:ilvl="1" w:tplc="240A0019" w:tentative="1">
+      <w:start w:val="1"/>
+      <w:numFmt w:val="lowerLetter"/>
+      <w:lvlText w:val="%2."/>
+      <w:lvlJc w:val="left"/>
+      <w:pPr>
+        <w:ind w:left="1440" w:hanging="360"/>
+      </w:pPr>
+    </w:lvl>
+    <w:lvl w:ilvl="2" w:tplc="240A001B" w:tentative="1">
+      <w:start w:val="1"/>
+      <w:numFmt w:val="lowerRoman"/>
+      <w:lvlText w:val="%3."/>
+      <w:lvlJc w:val="right"/>
+      <w:pPr>
+        <w:ind w:left="2160" w:hanging="180"/>
+      </w:pPr>
+    </w:lvl>
+    <w:lvl w:ilvl="3" w:tplc="240A000F" w:tentative="1">
+      <w:start w:val="1"/>
+      <w:numFmt w:val="decimal"/>
+      <w:lvlText w:val="%4."/>
+      <w:lvlJc w:val="left"/>
+      <w:pPr>
+        <w:ind w:left="2880" w:hanging="360"/>
+      </w:pPr>
+    </w:lvl>
+    <w:lvl w:ilvl="4" w:tplc="240A0019" w:tentative="1">
+      <w:start w:val="1"/>
+      <w:numFmt w:val="lowerLetter"/>
+      <w:lvlText w:val="%5."/>
+      <w:lvlJc w:val="left"/>
+      <w:pPr>
+        <w:ind w:left="3600" w:hanging="360"/>
+      </w:pPr>
+    </w:lvl>
+    <w:lvl w:ilvl="5" w:tplc="240A001B" w:tentative="1">
+      <w:start w:val="1"/>
+      <w:numFmt w:val="lowerRoman"/>
+      <w:lvlText w:val="%6."/>
+      <w:lvlJc w:val="right"/>
+      <w:pPr>
+        <w:ind w:left="4320" w:hanging="180"/>
+      </w:pPr>
+    </w:lvl>
+    <w:lvl w:ilvl="6" w:tplc="240A000F" w:tentative="1">
+      <w:start w:val="1"/>
+      <w:numFmt w:val="decimal"/>
+      <w:lvlText w:val="%7."/>
+      <w:lvlJc w:val="left"/>
+      <w:pPr>
+        <w:ind w:left="5040" w:hanging="360"/>
+      </w:pPr>
+    </w:lvl>
+    <w:lvl w:ilvl="7" w:tplc="240A0019" w:tentative="1">
+      <w:start w:val="1"/>
+      <w:numFmt w:val="lowerLetter"/>
+      <w:lvlText w:val="%8."/>
+      <w:lvlJc w:val="left"/>
+      <w:pPr>
+        <w:ind w:left="5760" w:hanging="360"/>
+      </w:pPr>
+    </w:lvl>
+    <w:lvl w:ilvl="8" w:tplc="240A001B" w:tentative="1">
+      <w:start w:val="1"/>
+      <w:numFmt w:val="lowerRoman"/>
+      <w:lvlText w:val="%9."/>
+      <w:lvlJc w:val="right"/>
+      <w:pPr>
+        <w:ind w:left="6480" w:hanging="180"/>
+      </w:pPr>
+    </w:lvl>
+  </w:abstractNum>
+  <w:abstractNum w:abstractNumId="21" w15:restartNumberingAfterBreak="0">
     <w:nsid w:val="2F2B449C"/>
     <w:multiLevelType w:val="hybridMultilevel"/>
     <w:tmpl w:val="E6BC529E"/>
@@ -11126,7 +12559,7 @@
       </w:pPr>
     </w:lvl>
   </w:abstractNum>
-  <w:abstractNum w:abstractNumId="21" w15:restartNumberingAfterBreak="0">
+  <w:abstractNum w:abstractNumId="22" w15:restartNumberingAfterBreak="0">
     <w:nsid w:val="38945076"/>
     <w:multiLevelType w:val="multilevel"/>
     <w:tmpl w:val="EBD62484"/>
@@ -11239,7 +12672,7 @@
       </w:pPr>
     </w:lvl>
   </w:abstractNum>
-  <w:abstractNum w:abstractNumId="22" w15:restartNumberingAfterBreak="0">
+  <w:abstractNum w:abstractNumId="23" w15:restartNumberingAfterBreak="0">
     <w:nsid w:val="3C821716"/>
     <w:multiLevelType w:val="multilevel"/>
     <w:tmpl w:val="BBA07FB6"/>
@@ -11352,7 +12785,7 @@
       </w:pPr>
     </w:lvl>
   </w:abstractNum>
-  <w:abstractNum w:abstractNumId="23" w15:restartNumberingAfterBreak="0">
+  <w:abstractNum w:abstractNumId="24" w15:restartNumberingAfterBreak="0">
     <w:nsid w:val="503B358D"/>
     <w:multiLevelType w:val="multilevel"/>
     <w:tmpl w:val="5426C4EC"/>
@@ -11465,7 +12898,7 @@
       </w:pPr>
     </w:lvl>
   </w:abstractNum>
-  <w:abstractNum w:abstractNumId="24" w15:restartNumberingAfterBreak="0">
+  <w:abstractNum w:abstractNumId="25" w15:restartNumberingAfterBreak="0">
     <w:nsid w:val="5AEA1012"/>
     <w:multiLevelType w:val="multilevel"/>
     <w:tmpl w:val="5AEA1012"/>
@@ -11614,7 +13047,7 @@
       </w:rPr>
     </w:lvl>
   </w:abstractNum>
-  <w:abstractNum w:abstractNumId="25" w15:restartNumberingAfterBreak="0">
+  <w:abstractNum w:abstractNumId="26" w15:restartNumberingAfterBreak="0">
     <w:nsid w:val="6CCA530C"/>
     <w:multiLevelType w:val="multilevel"/>
     <w:tmpl w:val="6CCA530C"/>
@@ -11727,7 +13160,7 @@
       </w:pPr>
     </w:lvl>
   </w:abstractNum>
-  <w:abstractNum w:abstractNumId="26" w15:restartNumberingAfterBreak="0">
+  <w:abstractNum w:abstractNumId="27" w15:restartNumberingAfterBreak="0">
     <w:nsid w:val="78DE2291"/>
     <w:multiLevelType w:val="multilevel"/>
     <w:tmpl w:val="9B4E744C"/>
@@ -11844,7 +13277,7 @@
       </w:pPr>
     </w:lvl>
   </w:abstractNum>
-  <w:abstractNum w:abstractNumId="27" w15:restartNumberingAfterBreak="0">
+  <w:abstractNum w:abstractNumId="28" w15:restartNumberingAfterBreak="0">
     <w:nsid w:val="7C603531"/>
     <w:multiLevelType w:val="multilevel"/>
     <w:tmpl w:val="B84CCBEC"/>
@@ -11961,95 +13394,98 @@
       </w:pPr>
     </w:lvl>
   </w:abstractNum>
-  <w:num w:numId="1" w16cid:durableId="893736628">
+  <w:num w:numId="1">
     <w:abstractNumId w:val="1"/>
   </w:num>
-  <w:num w:numId="2" w16cid:durableId="1811092389">
+  <w:num w:numId="2">
     <w:abstractNumId w:val="0"/>
   </w:num>
-  <w:num w:numId="3" w16cid:durableId="1894924583">
+  <w:num w:numId="3">
     <w:abstractNumId w:val="4"/>
   </w:num>
-  <w:num w:numId="4" w16cid:durableId="1561138571">
+  <w:num w:numId="4">
     <w:abstractNumId w:val="2"/>
   </w:num>
-  <w:num w:numId="5" w16cid:durableId="609169100">
+  <w:num w:numId="5">
     <w:abstractNumId w:val="5"/>
   </w:num>
-  <w:num w:numId="6" w16cid:durableId="749162688">
+  <w:num w:numId="6">
     <w:abstractNumId w:val="3"/>
   </w:num>
-  <w:num w:numId="7" w16cid:durableId="1175879590">
+  <w:num w:numId="7">
     <w:abstractNumId w:val="8"/>
   </w:num>
-  <w:num w:numId="8" w16cid:durableId="341666033">
+  <w:num w:numId="8">
     <w:abstractNumId w:val="9"/>
   </w:num>
-  <w:num w:numId="9" w16cid:durableId="1366367944">
+  <w:num w:numId="9">
     <w:abstractNumId w:val="15"/>
   </w:num>
-  <w:num w:numId="10" w16cid:durableId="938563810">
+  <w:num w:numId="10">
     <w:abstractNumId w:val="12"/>
   </w:num>
-  <w:num w:numId="11" w16cid:durableId="623539923">
+  <w:num w:numId="11">
+    <w:abstractNumId w:val="25"/>
+  </w:num>
+  <w:num w:numId="12">
+    <w:abstractNumId w:val="19"/>
+  </w:num>
+  <w:num w:numId="13">
+    <w:abstractNumId w:val="13"/>
+  </w:num>
+  <w:num w:numId="14">
+    <w:abstractNumId w:val="6"/>
+  </w:num>
+  <w:num w:numId="15">
+    <w:abstractNumId w:val="26"/>
+  </w:num>
+  <w:num w:numId="16">
+    <w:abstractNumId w:val="11"/>
+  </w:num>
+  <w:num w:numId="17">
+    <w:abstractNumId w:val="17"/>
+  </w:num>
+  <w:num w:numId="18">
+    <w:abstractNumId w:val="16"/>
+  </w:num>
+  <w:num w:numId="19">
+    <w:abstractNumId w:val="18"/>
+  </w:num>
+  <w:num w:numId="20">
+    <w:abstractNumId w:val="14"/>
+  </w:num>
+  <w:num w:numId="21">
     <w:abstractNumId w:val="24"/>
   </w:num>
-  <w:num w:numId="12" w16cid:durableId="492189111">
-    <w:abstractNumId w:val="19"/>
+  <w:num w:numId="22">
+    <w:abstractNumId w:val="28"/>
   </w:num>
-  <w:num w:numId="13" w16cid:durableId="100997891">
-    <w:abstractNumId w:val="13"/>
+  <w:num w:numId="23">
+    <w:abstractNumId w:val="27"/>
   </w:num>
-  <w:num w:numId="14" w16cid:durableId="1666280108">
-    <w:abstractNumId w:val="6"/>
+  <w:num w:numId="24">
+    <w:abstractNumId w:val="22"/>
   </w:num>
-  <w:num w:numId="15" w16cid:durableId="1177189728">
-    <w:abstractNumId w:val="25"/>
-  </w:num>
-  <w:num w:numId="16" w16cid:durableId="424378299">
-    <w:abstractNumId w:val="11"/>
-  </w:num>
-  <w:num w:numId="17" w16cid:durableId="356002424">
-    <w:abstractNumId w:val="17"/>
-  </w:num>
-  <w:num w:numId="18" w16cid:durableId="1392772394">
-    <w:abstractNumId w:val="16"/>
-  </w:num>
-  <w:num w:numId="19" w16cid:durableId="147089818">
-    <w:abstractNumId w:val="18"/>
-  </w:num>
-  <w:num w:numId="20" w16cid:durableId="621692656">
-    <w:abstractNumId w:val="14"/>
-  </w:num>
-  <w:num w:numId="21" w16cid:durableId="362290102">
+  <w:num w:numId="25">
     <w:abstractNumId w:val="23"/>
   </w:num>
-  <w:num w:numId="22" w16cid:durableId="1477258979">
-    <w:abstractNumId w:val="27"/>
+  <w:num w:numId="26">
+    <w:abstractNumId w:val="10"/>
   </w:num>
-  <w:num w:numId="23" w16cid:durableId="2137487085">
-    <w:abstractNumId w:val="26"/>
-  </w:num>
-  <w:num w:numId="24" w16cid:durableId="618879445">
+  <w:num w:numId="27">
     <w:abstractNumId w:val="21"/>
   </w:num>
-  <w:num w:numId="25" w16cid:durableId="2038114167">
-    <w:abstractNumId w:val="22"/>
+  <w:num w:numId="28">
+    <w:abstractNumId w:val="7"/>
   </w:num>
-  <w:num w:numId="26" w16cid:durableId="707216572">
-    <w:abstractNumId w:val="10"/>
-  </w:num>
-  <w:num w:numId="27" w16cid:durableId="1852910100">
+  <w:num w:numId="29">
     <w:abstractNumId w:val="20"/>
-  </w:num>
-  <w:num w:numId="28" w16cid:durableId="439036149">
-    <w:abstractNumId w:val="7"/>
   </w:num>
 </w:numbering>
 </file>
 
 <file path=word/styles.xml><?xml version="1.0" encoding="utf-8"?>
-<w:styles xmlns:mc="http://schemas.openxmlformats.org/markup-compatibility/2006" xmlns:r="http://schemas.openxmlformats.org/officeDocument/2006/relationships" xmlns:w="http://schemas.openxmlformats.org/wordprocessingml/2006/main" xmlns:w14="http://schemas.microsoft.com/office/word/2010/wordml" xmlns:w15="http://schemas.microsoft.com/office/word/2012/wordml" xmlns:w16cex="http://schemas.microsoft.com/office/word/2018/wordml/cex" xmlns:w16cid="http://schemas.microsoft.com/office/word/2016/wordml/cid" xmlns:w16="http://schemas.microsoft.com/office/word/2018/wordml" xmlns:w16du="http://schemas.microsoft.com/office/word/2023/wordml/word16du" xmlns:w16sdtdh="http://schemas.microsoft.com/office/word/2020/wordml/sdtdatahash" xmlns:w16sdtfl="http://schemas.microsoft.com/office/word/2024/wordml/sdtformatlock" xmlns:w16se="http://schemas.microsoft.com/office/word/2015/wordml/symex" mc:Ignorable="w14 w15 w16se w16cid w16 w16cex w16sdtdh w16sdtfl w16du">
+<w:styles xmlns:mc="http://schemas.openxmlformats.org/markup-compatibility/2006" xmlns:r="http://schemas.openxmlformats.org/officeDocument/2006/relationships" xmlns:w="http://schemas.openxmlformats.org/wordprocessingml/2006/main" xmlns:w14="http://schemas.microsoft.com/office/word/2010/wordml" xmlns:w15="http://schemas.microsoft.com/office/word/2012/wordml" xmlns:w16cid="http://schemas.microsoft.com/office/word/2016/wordml/cid" xmlns:w16se="http://schemas.microsoft.com/office/word/2015/wordml/symex" mc:Ignorable="w14 w15 w16se w16cid">
   <w:docDefaults>
     <w:rPrDefault>
       <w:rPr>
@@ -12059,7 +13495,7 @@
     </w:rPrDefault>
     <w:pPrDefault/>
   </w:docDefaults>
-  <w:latentStyles w:defLockedState="0" w:defUIPriority="99" w:defSemiHidden="0" w:defUnhideWhenUsed="0" w:defQFormat="0" w:count="376">
+  <w:latentStyles w:defLockedState="0" w:defUIPriority="99" w:defSemiHidden="0" w:defUnhideWhenUsed="0" w:defQFormat="0" w:count="375">
     <w:lsdException w:name="Normal" w:uiPriority="0" w:qFormat="1"/>
     <w:lsdException w:name="heading 1" w:uiPriority="9" w:qFormat="1"/>
     <w:lsdException w:name="heading 2" w:uiPriority="9" w:unhideWhenUsed="1" w:qFormat="1"/>
@@ -12214,7 +13650,7 @@
     <w:lsdException w:name="Table Web 2" w:semiHidden="1" w:unhideWhenUsed="1"/>
     <w:lsdException w:name="Table Web 3" w:semiHidden="1" w:unhideWhenUsed="1"/>
     <w:lsdException w:name="Balloon Text" w:semiHidden="1" w:unhideWhenUsed="1"/>
-    <w:lsdException w:name="Table Grid" w:uiPriority="39"/>
+    <w:lsdException w:name="Table Grid" w:uiPriority="59"/>
     <w:lsdException w:name="Table Theme" w:semiHidden="1" w:unhideWhenUsed="1"/>
     <w:lsdException w:name="Placeholder Text" w:semiHidden="1" w:unhideWhenUsed="1"/>
     <w:lsdException w:name="No Spacing" w:uiPriority="1" w:qFormat="1"/>
@@ -12435,7 +13871,6 @@
     <w:lsdException w:name="Smart Hyperlink" w:semiHidden="1" w:unhideWhenUsed="1"/>
     <w:lsdException w:name="Hashtag" w:semiHidden="1" w:unhideWhenUsed="1"/>
     <w:lsdException w:name="Unresolved Mention" w:semiHidden="1" w:unhideWhenUsed="1"/>
-    <w:lsdException w:name="Smart Link" w:semiHidden="1" w:unhideWhenUsed="1"/>
   </w:latentStyles>
   <w:style w:type="paragraph" w:default="1" w:styleId="Normal">
     <w:name w:val="Normal"/>
@@ -13101,7 +14536,7 @@
   <w:style w:type="table" w:styleId="Tablaconcuadrcula">
     <w:name w:val="Table Grid"/>
     <w:basedOn w:val="Tablanormal"/>
-    <w:uiPriority w:val="39"/>
+    <w:uiPriority w:val="59"/>
     <w:tblPr>
       <w:tblBorders>
         <w:top w:val="single" w:sz="4" w:space="0" w:color="auto"/>
@@ -23426,7 +24861,7 @@
 </file>
 
 <file path=customXml/itemProps1.xml><?xml version="1.0" encoding="utf-8"?>
-<ds:datastoreItem xmlns:ds="http://schemas.openxmlformats.org/officeDocument/2006/customXml" ds:itemID="{EF278816-EC6F-A645-907D-7F25AECB1D4A}">
+<ds:datastoreItem xmlns:ds="http://schemas.openxmlformats.org/officeDocument/2006/customXml" ds:itemID="{2C1A1E2C-DF62-4E71-93EA-F5EF1A529208}">
   <ds:schemaRefs>
     <ds:schemaRef ds:uri="http://schemas.openxmlformats.org/officeDocument/2006/bibliography"/>
   </ds:schemaRefs>

</xml_diff>